<commit_message>
add remote joystick/key/data modules
</commit_message>
<xml_diff>
--- a/基础解析/5.无线通讯.docx
+++ b/基础解析/5.无线通讯.docx
@@ -23,6 +23,7 @@
       <w:pPr>
         <w:pStyle w:val="42"/>
         <w:numPr>
+          <w:ilvl w:val="1"/>
           <w:numId w:val="0"/>
         </w:numPr>
         <w:bidi w:val="0"/>
@@ -267,7 +268,9 @@
         </w:tblBorders>
         <w:tblLayout w:type="autofit"/>
         <w:tblCellMar>
+          <w:top w:w="0" w:type="dxa"/>
           <w:left w:w="108" w:type="dxa"/>
+          <w:bottom w:w="0" w:type="dxa"/>
           <w:right w:w="108" w:type="dxa"/>
         </w:tblCellMar>
       </w:tblPr>
@@ -289,7 +292,9 @@
             <w:insideV w:val="single" w:color="auto" w:sz="4" w:space="0"/>
           </w:tblBorders>
           <w:tblCellMar>
+            <w:top w:w="0" w:type="dxa"/>
             <w:left w:w="108" w:type="dxa"/>
+            <w:bottom w:w="0" w:type="dxa"/>
             <w:right w:w="108" w:type="dxa"/>
           </w:tblCellMar>
         </w:tblPrEx>
@@ -300,7 +305,9 @@
           <w:p>
             <w:pPr>
               <w:pStyle w:val="43"/>
+              <w:widowControl w:val="0"/>
               <w:numPr>
+                <w:ilvl w:val="2"/>
                 <w:numId w:val="0"/>
               </w:numPr>
               <w:rPr>
@@ -326,7 +333,9 @@
           <w:p>
             <w:pPr>
               <w:pStyle w:val="43"/>
+              <w:widowControl w:val="0"/>
               <w:numPr>
+                <w:ilvl w:val="2"/>
                 <w:numId w:val="0"/>
               </w:numPr>
               <w:rPr>
@@ -352,7 +361,9 @@
           <w:p>
             <w:pPr>
               <w:pStyle w:val="43"/>
+              <w:widowControl w:val="0"/>
               <w:numPr>
+                <w:ilvl w:val="2"/>
                 <w:numId w:val="0"/>
               </w:numPr>
               <w:rPr>
@@ -378,7 +389,9 @@
           <w:p>
             <w:pPr>
               <w:pStyle w:val="43"/>
+              <w:widowControl w:val="0"/>
               <w:numPr>
+                <w:ilvl w:val="2"/>
                 <w:numId w:val="0"/>
               </w:numPr>
               <w:rPr>
@@ -404,7 +417,9 @@
           <w:p>
             <w:pPr>
               <w:pStyle w:val="43"/>
+              <w:widowControl w:val="0"/>
               <w:numPr>
+                <w:ilvl w:val="2"/>
                 <w:numId w:val="0"/>
               </w:numPr>
               <w:rPr>
@@ -429,6 +444,7 @@
       <w:pPr>
         <w:pStyle w:val="42"/>
         <w:numPr>
+          <w:ilvl w:val="1"/>
           <w:numId w:val="0"/>
         </w:numPr>
         <w:bidi w:val="0"/>
@@ -498,6 +514,7 @@
           <w:pPr>
             <w:pStyle w:val="43"/>
             <w:numPr>
+              <w:ilvl w:val="2"/>
               <w:numId w:val="0"/>
             </w:numPr>
             <w:shd w:val="clear" w:fill="F5F5F5"/>
@@ -560,6 +577,7 @@
           <w:pPr>
             <w:pStyle w:val="43"/>
             <w:numPr>
+              <w:ilvl w:val="2"/>
               <w:numId w:val="0"/>
             </w:numPr>
             <w:shd w:val="clear" w:fill="F5F5F5"/>
@@ -622,6 +640,7 @@
           <w:pPr>
             <w:pStyle w:val="43"/>
             <w:numPr>
+              <w:ilvl w:val="2"/>
               <w:numId w:val="0"/>
             </w:numPr>
             <w:shd w:val="clear" w:fill="F5F5F5"/>
@@ -645,6 +664,7 @@
           <w:pPr>
             <w:pStyle w:val="43"/>
             <w:numPr>
+              <w:ilvl w:val="2"/>
               <w:numId w:val="0"/>
             </w:numPr>
             <w:shd w:val="clear" w:fill="F5F5F5"/>
@@ -707,15 +727,16 @@
           <w:pPr>
             <w:pStyle w:val="43"/>
             <w:numPr>
-              <w:numId w:val="0"/>
-            </w:numPr>
-            <w:shd w:val="clear" w:fill="F5F5F5"/>
-            <w:spacing w:line="240" w:lineRule="auto"/>
-            <w:ind w:left="420" w:leftChars="200"/>
-            <w:jc w:val="left"/>
-            <w:outlineLvl w:val="9"/>
-            <w:rPr>
-              <w:rFonts w:hint="eastAsia" w:ascii="Consolas" w:hAnsi="Times New Roman" w:eastAsia="宋体" w:cs="Times New Roman"/>
+              <w:ilvl w:val="2"/>
+              <w:numId w:val="0"/>
+            </w:numPr>
+            <w:shd w:val="clear" w:fill="F5F5F5"/>
+            <w:spacing w:line="240" w:lineRule="auto"/>
+            <w:ind w:left="420" w:leftChars="200"/>
+            <w:jc w:val="left"/>
+            <w:outlineLvl w:val="9"/>
+            <w:rPr>
+              <w:rFonts w:hint="default" w:ascii="Consolas" w:hAnsi="Times New Roman" w:eastAsia="宋体" w:cs="Times New Roman"/>
               <w:b/>
               <w:color w:val="252525"/>
               <w:kern w:val="2"/>
@@ -749,6 +770,69 @@
               <w:shd w:val="clear"/>
               <w:lang w:val="en-US" w:eastAsia="zh-CN" w:bidi="ar-SA"/>
             </w:rPr>
+            <w:t xml:space="preserve"> "Com_debug.h</w:t>
+          </w:r>
+          <w:r>
+            <w:rPr>
+              <w:rFonts w:hint="default" w:ascii="Consolas" w:cs="Times New Roman"/>
+              <w:b/>
+              <w:color w:val="252525"/>
+              <w:kern w:val="2"/>
+              <w:sz w:val="21"/>
+              <w:szCs w:val="28"/>
+              <w:shd w:val="clear"/>
+              <w:lang w:val="en-US" w:eastAsia="zh-CN" w:bidi="ar-SA"/>
+            </w:rPr>
+            <w:t>”</w:t>
+          </w:r>
+        </w:p>
+        <w:p>
+          <w:pPr>
+            <w:pStyle w:val="43"/>
+            <w:numPr>
+              <w:ilvl w:val="2"/>
+              <w:numId w:val="0"/>
+            </w:numPr>
+            <w:shd w:val="clear" w:fill="F5F5F5"/>
+            <w:spacing w:line="240" w:lineRule="auto"/>
+            <w:ind w:left="420" w:leftChars="200"/>
+            <w:jc w:val="left"/>
+            <w:outlineLvl w:val="9"/>
+            <w:rPr>
+              <w:rFonts w:hint="eastAsia" w:ascii="Consolas" w:hAnsi="Times New Roman" w:eastAsia="宋体" w:cs="Times New Roman"/>
+              <w:b/>
+              <w:color w:val="252525"/>
+              <w:kern w:val="2"/>
+              <w:sz w:val="21"/>
+              <w:szCs w:val="28"/>
+              <w:shd w:val="clear"/>
+              <w:lang w:val="en-US" w:eastAsia="zh-CN" w:bidi="ar-SA"/>
+            </w:rPr>
+          </w:pPr>
+          <w:r>
+            <w:rPr>
+              <w:rFonts w:hint="eastAsia" w:ascii="Consolas" w:hAnsi="Times New Roman" w:eastAsia="宋体" w:cs="Times New Roman"/>
+              <w:b/>
+              <w:color w:val="1E5FC7"/>
+              <w:kern w:val="2"/>
+              <w:sz w:val="21"/>
+              <w:szCs w:val="28"/>
+              <w:shd w:val="clear"/>
+              <w:lang w:val="en-US" w:eastAsia="zh-CN" w:bidi="ar-SA"/>
+            </w:rPr>
+            <w:t>#include</w:t>
+          </w:r>
+          <w:r>
+            <w:rPr>
+              <w:rFonts w:hint="eastAsia" w:ascii="Consolas" w:hAnsi="Times New Roman" w:eastAsia="宋体" w:cs="Times New Roman"/>
+              <w:b/>
+              <w:color w:val="252525"/>
+              <w:kern w:val="2"/>
+              <w:sz w:val="21"/>
+              <w:szCs w:val="28"/>
+              <w:shd w:val="clear"/>
+              <w:lang w:val="en-US" w:eastAsia="zh-CN" w:bidi="ar-SA"/>
+            </w:rPr>
             <w:t xml:space="preserve"> </w:t>
           </w:r>
           <w:r>
@@ -762,36 +846,105 @@
               <w:shd w:val="clear"/>
               <w:lang w:val="en-US" w:eastAsia="zh-CN" w:bidi="ar-SA"/>
             </w:rPr>
-            <w:t>"Com_debug.h"</w:t>
-          </w:r>
+            <w:t>"freeRTOS.h"</w:t>
+          </w:r>
+          <w:bookmarkStart w:id="0" w:name="_GoBack"/>
+          <w:bookmarkEnd w:id="0"/>
         </w:p>
         <w:p>
           <w:pPr>
             <w:pStyle w:val="43"/>
             <w:numPr>
-              <w:numId w:val="0"/>
-            </w:numPr>
-            <w:shd w:val="clear" w:fill="F5F5F5"/>
-            <w:spacing w:line="240" w:lineRule="auto"/>
-            <w:ind w:left="420" w:leftChars="200"/>
-            <w:jc w:val="left"/>
-            <w:outlineLvl w:val="9"/>
-            <w:rPr>
-              <w:rFonts w:hint="eastAsia" w:ascii="Consolas" w:hAnsi="Times New Roman" w:eastAsia="宋体" w:cs="Times New Roman"/>
-              <w:b/>
-              <w:color w:val="252525"/>
-              <w:kern w:val="2"/>
-              <w:sz w:val="21"/>
-              <w:szCs w:val="28"/>
-              <w:shd w:val="clear"/>
-              <w:lang w:val="en-US" w:eastAsia="zh-CN" w:bidi="ar-SA"/>
-            </w:rPr>
-          </w:pPr>
+              <w:ilvl w:val="2"/>
+              <w:numId w:val="0"/>
+            </w:numPr>
+            <w:shd w:val="clear" w:fill="F5F5F5"/>
+            <w:spacing w:line="240" w:lineRule="auto"/>
+            <w:ind w:left="420" w:leftChars="200"/>
+            <w:jc w:val="left"/>
+            <w:outlineLvl w:val="9"/>
+            <w:rPr>
+              <w:rFonts w:hint="eastAsia" w:ascii="Consolas" w:hAnsi="Times New Roman" w:eastAsia="宋体" w:cs="Times New Roman"/>
+              <w:b/>
+              <w:color w:val="252525"/>
+              <w:kern w:val="2"/>
+              <w:sz w:val="21"/>
+              <w:szCs w:val="28"/>
+              <w:shd w:val="clear"/>
+              <w:lang w:val="en-US" w:eastAsia="zh-CN" w:bidi="ar-SA"/>
+            </w:rPr>
+          </w:pPr>
+          <w:r>
+            <w:rPr>
+              <w:rFonts w:hint="eastAsia" w:ascii="Consolas" w:hAnsi="Times New Roman" w:eastAsia="宋体" w:cs="Times New Roman"/>
+              <w:b/>
+              <w:color w:val="1E5FC7"/>
+              <w:kern w:val="2"/>
+              <w:sz w:val="21"/>
+              <w:szCs w:val="28"/>
+              <w:shd w:val="clear"/>
+              <w:lang w:val="en-US" w:eastAsia="zh-CN" w:bidi="ar-SA"/>
+            </w:rPr>
+            <w:t>#include</w:t>
+          </w:r>
+          <w:r>
+            <w:rPr>
+              <w:rFonts w:hint="eastAsia" w:ascii="Consolas" w:hAnsi="Times New Roman" w:eastAsia="宋体" w:cs="Times New Roman"/>
+              <w:b/>
+              <w:color w:val="252525"/>
+              <w:kern w:val="2"/>
+              <w:sz w:val="21"/>
+              <w:szCs w:val="28"/>
+              <w:shd w:val="clear"/>
+              <w:lang w:val="en-US" w:eastAsia="zh-CN" w:bidi="ar-SA"/>
+            </w:rPr>
+            <w:t xml:space="preserve"> </w:t>
+          </w:r>
+          <w:r>
+            <w:rPr>
+              <w:rFonts w:hint="eastAsia" w:ascii="Consolas" w:hAnsi="Times New Roman" w:eastAsia="宋体" w:cs="Times New Roman"/>
+              <w:b/>
+              <w:color w:val="C48200"/>
+              <w:kern w:val="2"/>
+              <w:sz w:val="21"/>
+              <w:szCs w:val="28"/>
+              <w:shd w:val="clear"/>
+              <w:lang w:val="en-US" w:eastAsia="zh-CN" w:bidi="ar-SA"/>
+            </w:rPr>
+            <w:t>"</w:t>
+          </w:r>
+          <w:r>
+            <w:rPr>
+              <w:rFonts w:hint="eastAsia" w:ascii="Consolas" w:cs="Times New Roman"/>
+              <w:b/>
+              <w:color w:val="C48200"/>
+              <w:kern w:val="2"/>
+              <w:sz w:val="21"/>
+              <w:szCs w:val="28"/>
+              <w:shd w:val="clear"/>
+              <w:lang w:val="en-US" w:eastAsia="zh-CN" w:bidi="ar-SA"/>
+            </w:rPr>
+            <w:t>task</w:t>
+          </w:r>
+          <w:r>
+            <w:rPr>
+              <w:rFonts w:hint="eastAsia" w:ascii="Consolas" w:hAnsi="Times New Roman" w:eastAsia="宋体" w:cs="Times New Roman"/>
+              <w:b/>
+              <w:color w:val="C48200"/>
+              <w:kern w:val="2"/>
+              <w:sz w:val="21"/>
+              <w:szCs w:val="28"/>
+              <w:shd w:val="clear"/>
+              <w:lang w:val="en-US" w:eastAsia="zh-CN" w:bidi="ar-SA"/>
+            </w:rPr>
+            <w:t>.h"</w:t>
+          </w:r>
         </w:p>
         <w:p>
           <w:pPr>
             <w:pStyle w:val="43"/>
             <w:numPr>
+              <w:ilvl w:val="2"/>
               <w:numId w:val="0"/>
             </w:numPr>
             <w:shd w:val="clear" w:fill="F5F5F5"/>
@@ -828,6 +981,7 @@
           <w:pPr>
             <w:pStyle w:val="43"/>
             <w:numPr>
+              <w:ilvl w:val="2"/>
               <w:numId w:val="0"/>
             </w:numPr>
             <w:shd w:val="clear" w:fill="F5F5F5"/>
@@ -864,6 +1018,7 @@
           <w:pPr>
             <w:pStyle w:val="43"/>
             <w:numPr>
+              <w:ilvl w:val="2"/>
               <w:numId w:val="0"/>
             </w:numPr>
             <w:shd w:val="clear" w:fill="F5F5F5"/>
@@ -952,6 +1107,7 @@
           <w:pPr>
             <w:pStyle w:val="43"/>
             <w:numPr>
+              <w:ilvl w:val="2"/>
               <w:numId w:val="0"/>
             </w:numPr>
             <w:shd w:val="clear" w:fill="F5F5F5"/>
@@ -988,6 +1144,7 @@
           <w:pPr>
             <w:pStyle w:val="43"/>
             <w:numPr>
+              <w:ilvl w:val="2"/>
               <w:numId w:val="0"/>
             </w:numPr>
             <w:shd w:val="clear" w:fill="F5F5F5"/>
@@ -1076,6 +1233,7 @@
           <w:pPr>
             <w:pStyle w:val="43"/>
             <w:numPr>
+              <w:ilvl w:val="2"/>
               <w:numId w:val="0"/>
             </w:numPr>
             <w:shd w:val="clear" w:fill="F5F5F5"/>
@@ -1099,6 +1257,7 @@
           <w:pPr>
             <w:pStyle w:val="43"/>
             <w:numPr>
+              <w:ilvl w:val="2"/>
               <w:numId w:val="0"/>
             </w:numPr>
             <w:shd w:val="clear" w:fill="F5F5F5"/>
@@ -1135,6 +1294,7 @@
           <w:pPr>
             <w:pStyle w:val="43"/>
             <w:numPr>
+              <w:ilvl w:val="2"/>
               <w:numId w:val="0"/>
             </w:numPr>
             <w:shd w:val="clear" w:fill="F5F5F5"/>
@@ -1223,6 +1383,7 @@
           <w:pPr>
             <w:pStyle w:val="43"/>
             <w:numPr>
+              <w:ilvl w:val="2"/>
               <w:numId w:val="0"/>
             </w:numPr>
             <w:shd w:val="clear" w:fill="F5F5F5"/>
@@ -1259,6 +1420,7 @@
           <w:pPr>
             <w:pStyle w:val="43"/>
             <w:numPr>
+              <w:ilvl w:val="2"/>
               <w:numId w:val="0"/>
             </w:numPr>
             <w:shd w:val="clear" w:fill="F5F5F5"/>
@@ -1347,6 +1509,7 @@
           <w:pPr>
             <w:pStyle w:val="43"/>
             <w:numPr>
+              <w:ilvl w:val="2"/>
               <w:numId w:val="0"/>
             </w:numPr>
             <w:shd w:val="clear" w:fill="F5F5F5"/>
@@ -1370,6 +1533,7 @@
           <w:pPr>
             <w:pStyle w:val="43"/>
             <w:numPr>
+              <w:ilvl w:val="2"/>
               <w:numId w:val="0"/>
             </w:numPr>
             <w:shd w:val="clear" w:fill="F5F5F5"/>
@@ -1406,6 +1570,7 @@
           <w:pPr>
             <w:pStyle w:val="43"/>
             <w:numPr>
+              <w:ilvl w:val="2"/>
               <w:numId w:val="0"/>
             </w:numPr>
             <w:shd w:val="clear" w:fill="F5F5F5"/>
@@ -1494,6 +1659,7 @@
           <w:pPr>
             <w:pStyle w:val="43"/>
             <w:numPr>
+              <w:ilvl w:val="2"/>
               <w:numId w:val="0"/>
             </w:numPr>
             <w:shd w:val="clear" w:fill="F5F5F5"/>
@@ -1582,6 +1748,7 @@
           <w:pPr>
             <w:pStyle w:val="43"/>
             <w:numPr>
+              <w:ilvl w:val="2"/>
               <w:numId w:val="0"/>
             </w:numPr>
             <w:shd w:val="clear" w:fill="F5F5F5"/>
@@ -1670,6 +1837,7 @@
           <w:pPr>
             <w:pStyle w:val="43"/>
             <w:numPr>
+              <w:ilvl w:val="2"/>
               <w:numId w:val="0"/>
             </w:numPr>
             <w:shd w:val="clear" w:fill="F5F5F5"/>
@@ -1693,6 +1861,7 @@
           <w:pPr>
             <w:pStyle w:val="43"/>
             <w:numPr>
+              <w:ilvl w:val="2"/>
               <w:numId w:val="0"/>
             </w:numPr>
             <w:shd w:val="clear" w:fill="F5F5F5"/>
@@ -1729,6 +1898,7 @@
           <w:pPr>
             <w:pStyle w:val="43"/>
             <w:numPr>
+              <w:ilvl w:val="2"/>
               <w:numId w:val="0"/>
             </w:numPr>
             <w:shd w:val="clear" w:fill="F5F5F5"/>
@@ -1765,6 +1935,7 @@
           <w:pPr>
             <w:pStyle w:val="43"/>
             <w:numPr>
+              <w:ilvl w:val="2"/>
               <w:numId w:val="0"/>
             </w:numPr>
             <w:shd w:val="clear" w:fill="F5F5F5"/>
@@ -1853,6 +2024,7 @@
           <w:pPr>
             <w:pStyle w:val="43"/>
             <w:numPr>
+              <w:ilvl w:val="2"/>
               <w:numId w:val="0"/>
             </w:numPr>
             <w:shd w:val="clear" w:fill="F5F5F5"/>
@@ -1941,6 +2113,7 @@
           <w:pPr>
             <w:pStyle w:val="43"/>
             <w:numPr>
+              <w:ilvl w:val="2"/>
               <w:numId w:val="0"/>
             </w:numPr>
             <w:shd w:val="clear" w:fill="F5F5F5"/>
@@ -2029,6 +2202,7 @@
           <w:pPr>
             <w:pStyle w:val="43"/>
             <w:numPr>
+              <w:ilvl w:val="2"/>
               <w:numId w:val="0"/>
             </w:numPr>
             <w:shd w:val="clear" w:fill="F5F5F5"/>
@@ -2117,6 +2291,7 @@
           <w:pPr>
             <w:pStyle w:val="43"/>
             <w:numPr>
+              <w:ilvl w:val="2"/>
               <w:numId w:val="0"/>
             </w:numPr>
             <w:shd w:val="clear" w:fill="F5F5F5"/>
@@ -2205,6 +2380,7 @@
           <w:pPr>
             <w:pStyle w:val="43"/>
             <w:numPr>
+              <w:ilvl w:val="2"/>
               <w:numId w:val="0"/>
             </w:numPr>
             <w:shd w:val="clear" w:fill="F5F5F5"/>
@@ -2293,6 +2469,7 @@
           <w:pPr>
             <w:pStyle w:val="43"/>
             <w:numPr>
+              <w:ilvl w:val="2"/>
               <w:numId w:val="0"/>
             </w:numPr>
             <w:shd w:val="clear" w:fill="F5F5F5"/>
@@ -2381,6 +2558,7 @@
           <w:pPr>
             <w:pStyle w:val="43"/>
             <w:numPr>
+              <w:ilvl w:val="2"/>
               <w:numId w:val="0"/>
             </w:numPr>
             <w:shd w:val="clear" w:fill="F5F5F5"/>
@@ -2469,6 +2647,7 @@
           <w:pPr>
             <w:pStyle w:val="43"/>
             <w:numPr>
+              <w:ilvl w:val="2"/>
               <w:numId w:val="0"/>
             </w:numPr>
             <w:shd w:val="clear" w:fill="F5F5F5"/>
@@ -2492,6 +2671,7 @@
           <w:pPr>
             <w:pStyle w:val="43"/>
             <w:numPr>
+              <w:ilvl w:val="2"/>
               <w:numId w:val="0"/>
             </w:numPr>
             <w:shd w:val="clear" w:fill="F5F5F5"/>
@@ -2528,6 +2708,7 @@
           <w:pPr>
             <w:pStyle w:val="43"/>
             <w:numPr>
+              <w:ilvl w:val="2"/>
               <w:numId w:val="0"/>
             </w:numPr>
             <w:shd w:val="clear" w:fill="F5F5F5"/>
@@ -2564,6 +2745,7 @@
           <w:pPr>
             <w:pStyle w:val="43"/>
             <w:numPr>
+              <w:ilvl w:val="2"/>
               <w:numId w:val="0"/>
             </w:numPr>
             <w:shd w:val="clear" w:fill="F5F5F5"/>
@@ -2652,6 +2834,7 @@
           <w:pPr>
             <w:pStyle w:val="43"/>
             <w:numPr>
+              <w:ilvl w:val="2"/>
               <w:numId w:val="0"/>
             </w:numPr>
             <w:shd w:val="clear" w:fill="F5F5F5"/>
@@ -2740,6 +2923,7 @@
           <w:pPr>
             <w:pStyle w:val="43"/>
             <w:numPr>
+              <w:ilvl w:val="2"/>
               <w:numId w:val="0"/>
             </w:numPr>
             <w:shd w:val="clear" w:fill="F5F5F5"/>
@@ -2828,6 +3012,7 @@
           <w:pPr>
             <w:pStyle w:val="43"/>
             <w:numPr>
+              <w:ilvl w:val="2"/>
               <w:numId w:val="0"/>
             </w:numPr>
             <w:shd w:val="clear" w:fill="F5F5F5"/>
@@ -2916,6 +3101,7 @@
           <w:pPr>
             <w:pStyle w:val="43"/>
             <w:numPr>
+              <w:ilvl w:val="2"/>
               <w:numId w:val="0"/>
             </w:numPr>
             <w:shd w:val="clear" w:fill="F5F5F5"/>
@@ -3004,6 +3190,7 @@
           <w:pPr>
             <w:pStyle w:val="43"/>
             <w:numPr>
+              <w:ilvl w:val="2"/>
               <w:numId w:val="0"/>
             </w:numPr>
             <w:shd w:val="clear" w:fill="F5F5F5"/>
@@ -3092,6 +3279,7 @@
           <w:pPr>
             <w:pStyle w:val="43"/>
             <w:numPr>
+              <w:ilvl w:val="2"/>
               <w:numId w:val="0"/>
             </w:numPr>
             <w:shd w:val="clear" w:fill="F5F5F5"/>
@@ -3180,6 +3368,7 @@
           <w:pPr>
             <w:pStyle w:val="43"/>
             <w:numPr>
+              <w:ilvl w:val="2"/>
               <w:numId w:val="0"/>
             </w:numPr>
             <w:shd w:val="clear" w:fill="F5F5F5"/>
@@ -3268,6 +3457,7 @@
           <w:pPr>
             <w:pStyle w:val="43"/>
             <w:numPr>
+              <w:ilvl w:val="2"/>
               <w:numId w:val="0"/>
             </w:numPr>
             <w:shd w:val="clear" w:fill="F5F5F5"/>
@@ -3356,6 +3546,7 @@
           <w:pPr>
             <w:pStyle w:val="43"/>
             <w:numPr>
+              <w:ilvl w:val="2"/>
               <w:numId w:val="0"/>
             </w:numPr>
             <w:shd w:val="clear" w:fill="F5F5F5"/>
@@ -3444,6 +3635,7 @@
           <w:pPr>
             <w:pStyle w:val="43"/>
             <w:numPr>
+              <w:ilvl w:val="2"/>
               <w:numId w:val="0"/>
             </w:numPr>
             <w:shd w:val="clear" w:fill="F5F5F5"/>
@@ -3532,6 +3724,7 @@
           <w:pPr>
             <w:pStyle w:val="43"/>
             <w:numPr>
+              <w:ilvl w:val="2"/>
               <w:numId w:val="0"/>
             </w:numPr>
             <w:shd w:val="clear" w:fill="F5F5F5"/>
@@ -3620,6 +3813,7 @@
           <w:pPr>
             <w:pStyle w:val="43"/>
             <w:numPr>
+              <w:ilvl w:val="2"/>
               <w:numId w:val="0"/>
             </w:numPr>
             <w:shd w:val="clear" w:fill="F5F5F5"/>
@@ -3708,6 +3902,7 @@
           <w:pPr>
             <w:pStyle w:val="43"/>
             <w:numPr>
+              <w:ilvl w:val="2"/>
               <w:numId w:val="0"/>
             </w:numPr>
             <w:shd w:val="clear" w:fill="F5F5F5"/>
@@ -3796,6 +3991,7 @@
           <w:pPr>
             <w:pStyle w:val="43"/>
             <w:numPr>
+              <w:ilvl w:val="2"/>
               <w:numId w:val="0"/>
             </w:numPr>
             <w:shd w:val="clear" w:fill="F5F5F5"/>
@@ -3884,6 +4080,7 @@
           <w:pPr>
             <w:pStyle w:val="43"/>
             <w:numPr>
+              <w:ilvl w:val="2"/>
               <w:numId w:val="0"/>
             </w:numPr>
             <w:shd w:val="clear" w:fill="F5F5F5"/>
@@ -3972,6 +4169,7 @@
           <w:pPr>
             <w:pStyle w:val="43"/>
             <w:numPr>
+              <w:ilvl w:val="2"/>
               <w:numId w:val="0"/>
             </w:numPr>
             <w:shd w:val="clear" w:fill="F5F5F5"/>
@@ -4060,6 +4258,7 @@
           <w:pPr>
             <w:pStyle w:val="43"/>
             <w:numPr>
+              <w:ilvl w:val="2"/>
               <w:numId w:val="0"/>
             </w:numPr>
             <w:shd w:val="clear" w:fill="F5F5F5"/>
@@ -4148,6 +4347,7 @@
           <w:pPr>
             <w:pStyle w:val="43"/>
             <w:numPr>
+              <w:ilvl w:val="2"/>
               <w:numId w:val="0"/>
             </w:numPr>
             <w:shd w:val="clear" w:fill="F5F5F5"/>
@@ -4236,6 +4436,7 @@
           <w:pPr>
             <w:pStyle w:val="43"/>
             <w:numPr>
+              <w:ilvl w:val="2"/>
               <w:numId w:val="0"/>
             </w:numPr>
             <w:shd w:val="clear" w:fill="F5F5F5"/>
@@ -4324,6 +4525,7 @@
           <w:pPr>
             <w:pStyle w:val="43"/>
             <w:numPr>
+              <w:ilvl w:val="2"/>
               <w:numId w:val="0"/>
             </w:numPr>
             <w:shd w:val="clear" w:fill="F5F5F5"/>
@@ -4412,6 +4614,7 @@
           <w:pPr>
             <w:pStyle w:val="43"/>
             <w:numPr>
+              <w:ilvl w:val="2"/>
               <w:numId w:val="0"/>
             </w:numPr>
             <w:shd w:val="clear" w:fill="F5F5F5"/>
@@ -4500,6 +4703,7 @@
           <w:pPr>
             <w:pStyle w:val="43"/>
             <w:numPr>
+              <w:ilvl w:val="2"/>
               <w:numId w:val="0"/>
             </w:numPr>
             <w:shd w:val="clear" w:fill="F5F5F5"/>
@@ -4588,6 +4792,7 @@
           <w:pPr>
             <w:pStyle w:val="43"/>
             <w:numPr>
+              <w:ilvl w:val="2"/>
               <w:numId w:val="0"/>
             </w:numPr>
             <w:shd w:val="clear" w:fill="F5F5F5"/>
@@ -4676,6 +4881,7 @@
           <w:pPr>
             <w:pStyle w:val="43"/>
             <w:numPr>
+              <w:ilvl w:val="2"/>
               <w:numId w:val="0"/>
             </w:numPr>
             <w:shd w:val="clear" w:fill="F5F5F5"/>
@@ -4699,6 +4905,7 @@
           <w:pPr>
             <w:pStyle w:val="43"/>
             <w:numPr>
+              <w:ilvl w:val="2"/>
               <w:numId w:val="0"/>
             </w:numPr>
             <w:shd w:val="clear" w:fill="F5F5F5"/>
@@ -4735,6 +4942,7 @@
           <w:pPr>
             <w:pStyle w:val="43"/>
             <w:numPr>
+              <w:ilvl w:val="2"/>
               <w:numId w:val="0"/>
             </w:numPr>
             <w:shd w:val="clear" w:fill="F5F5F5"/>
@@ -4771,6 +4979,7 @@
           <w:pPr>
             <w:pStyle w:val="43"/>
             <w:numPr>
+              <w:ilvl w:val="2"/>
               <w:numId w:val="0"/>
             </w:numPr>
             <w:shd w:val="clear" w:fill="F5F5F5"/>
@@ -4872,6 +5081,7 @@
           <w:pPr>
             <w:pStyle w:val="43"/>
             <w:numPr>
+              <w:ilvl w:val="2"/>
               <w:numId w:val="0"/>
             </w:numPr>
             <w:shd w:val="clear" w:fill="F5F5F5"/>
@@ -4960,6 +5170,7 @@
           <w:pPr>
             <w:pStyle w:val="43"/>
             <w:numPr>
+              <w:ilvl w:val="2"/>
               <w:numId w:val="0"/>
             </w:numPr>
             <w:shd w:val="clear" w:fill="F5F5F5"/>
@@ -5048,6 +5259,7 @@
           <w:pPr>
             <w:pStyle w:val="43"/>
             <w:numPr>
+              <w:ilvl w:val="2"/>
               <w:numId w:val="0"/>
             </w:numPr>
             <w:shd w:val="clear" w:fill="F5F5F5"/>
@@ -5071,6 +5283,7 @@
           <w:pPr>
             <w:pStyle w:val="43"/>
             <w:numPr>
+              <w:ilvl w:val="2"/>
               <w:numId w:val="0"/>
             </w:numPr>
             <w:shd w:val="clear" w:fill="F5F5F5"/>
@@ -5107,6 +5320,7 @@
           <w:pPr>
             <w:pStyle w:val="43"/>
             <w:numPr>
+              <w:ilvl w:val="2"/>
               <w:numId w:val="0"/>
             </w:numPr>
             <w:shd w:val="clear" w:fill="F5F5F5"/>
@@ -5143,6 +5357,7 @@
           <w:pPr>
             <w:pStyle w:val="43"/>
             <w:numPr>
+              <w:ilvl w:val="2"/>
               <w:numId w:val="0"/>
             </w:numPr>
             <w:shd w:val="clear" w:fill="F5F5F5"/>
@@ -5179,6 +5394,7 @@
           <w:pPr>
             <w:pStyle w:val="43"/>
             <w:numPr>
+              <w:ilvl w:val="2"/>
               <w:numId w:val="0"/>
             </w:numPr>
             <w:shd w:val="clear" w:fill="F5F5F5"/>
@@ -5215,6 +5431,7 @@
           <w:pPr>
             <w:pStyle w:val="43"/>
             <w:numPr>
+              <w:ilvl w:val="2"/>
               <w:numId w:val="0"/>
             </w:numPr>
             <w:shd w:val="clear" w:fill="F5F5F5"/>
@@ -5238,6 +5455,7 @@
           <w:pPr>
             <w:pStyle w:val="43"/>
             <w:numPr>
+              <w:ilvl w:val="2"/>
               <w:numId w:val="0"/>
             </w:numPr>
             <w:shd w:val="clear" w:fill="F5F5F5"/>
@@ -5274,6 +5492,7 @@
           <w:pPr>
             <w:pStyle w:val="43"/>
             <w:numPr>
+              <w:ilvl w:val="2"/>
               <w:numId w:val="0"/>
             </w:numPr>
             <w:shd w:val="clear" w:fill="F5F5F5"/>
@@ -5310,6 +5529,7 @@
           <w:pPr>
             <w:pStyle w:val="43"/>
             <w:numPr>
+              <w:ilvl w:val="2"/>
               <w:numId w:val="0"/>
             </w:numPr>
             <w:shd w:val="clear" w:fill="F5F5F5"/>
@@ -5346,6 +5566,7 @@
           <w:pPr>
             <w:pStyle w:val="43"/>
             <w:numPr>
+              <w:ilvl w:val="2"/>
               <w:numId w:val="0"/>
             </w:numPr>
             <w:shd w:val="clear" w:fill="F5F5F5"/>
@@ -5382,6 +5603,7 @@
           <w:pPr>
             <w:pStyle w:val="43"/>
             <w:numPr>
+              <w:ilvl w:val="2"/>
               <w:numId w:val="0"/>
             </w:numPr>
             <w:shd w:val="clear" w:fill="F5F5F5"/>
@@ -5418,6 +5640,7 @@
           <w:pPr>
             <w:pStyle w:val="43"/>
             <w:numPr>
+              <w:ilvl w:val="2"/>
               <w:numId w:val="0"/>
             </w:numPr>
             <w:shd w:val="clear" w:fill="F5F5F5"/>
@@ -5454,6 +5677,7 @@
           <w:pPr>
             <w:pStyle w:val="43"/>
             <w:numPr>
+              <w:ilvl w:val="2"/>
               <w:numId w:val="0"/>
             </w:numPr>
             <w:shd w:val="clear" w:fill="F5F5F5"/>
@@ -5633,6 +5857,7 @@
           <w:pPr>
             <w:pStyle w:val="43"/>
             <w:numPr>
+              <w:ilvl w:val="2"/>
               <w:numId w:val="0"/>
             </w:numPr>
             <w:shd w:val="clear" w:fill="F5F5F5"/>
@@ -5669,6 +5894,7 @@
           <w:pPr>
             <w:pStyle w:val="43"/>
             <w:numPr>
+              <w:ilvl w:val="2"/>
               <w:numId w:val="0"/>
             </w:numPr>
             <w:shd w:val="clear" w:fill="F5F5F5"/>
@@ -5705,6 +5931,7 @@
           <w:pPr>
             <w:pStyle w:val="43"/>
             <w:numPr>
+              <w:ilvl w:val="2"/>
               <w:numId w:val="0"/>
             </w:numPr>
             <w:shd w:val="clear" w:fill="F5F5F5"/>
@@ -5741,6 +5968,7 @@
           <w:pPr>
             <w:pStyle w:val="43"/>
             <w:numPr>
+              <w:ilvl w:val="2"/>
               <w:numId w:val="0"/>
             </w:numPr>
             <w:shd w:val="clear" w:fill="F5F5F5"/>
@@ -5777,6 +6005,7 @@
           <w:pPr>
             <w:pStyle w:val="43"/>
             <w:numPr>
+              <w:ilvl w:val="2"/>
               <w:numId w:val="0"/>
             </w:numPr>
             <w:shd w:val="clear" w:fill="F5F5F5"/>
@@ -5813,6 +6042,7 @@
           <w:pPr>
             <w:pStyle w:val="43"/>
             <w:numPr>
+              <w:ilvl w:val="2"/>
               <w:numId w:val="0"/>
             </w:numPr>
             <w:shd w:val="clear" w:fill="F5F5F5"/>
@@ -5849,6 +6079,7 @@
           <w:pPr>
             <w:pStyle w:val="43"/>
             <w:numPr>
+              <w:ilvl w:val="2"/>
               <w:numId w:val="0"/>
             </w:numPr>
             <w:shd w:val="clear" w:fill="F5F5F5"/>
@@ -5885,6 +6116,7 @@
           <w:pPr>
             <w:pStyle w:val="43"/>
             <w:numPr>
+              <w:ilvl w:val="2"/>
               <w:numId w:val="0"/>
             </w:numPr>
             <w:shd w:val="clear" w:fill="F5F5F5"/>
@@ -6142,6 +6374,7 @@
           <w:pPr>
             <w:pStyle w:val="43"/>
             <w:numPr>
+              <w:ilvl w:val="2"/>
               <w:numId w:val="0"/>
             </w:numPr>
             <w:shd w:val="clear" w:fill="F5F5F5"/>
@@ -6178,6 +6411,7 @@
           <w:pPr>
             <w:pStyle w:val="43"/>
             <w:numPr>
+              <w:ilvl w:val="2"/>
               <w:numId w:val="0"/>
             </w:numPr>
             <w:shd w:val="clear" w:fill="F5F5F5"/>
@@ -6214,6 +6448,7 @@
           <w:pPr>
             <w:pStyle w:val="43"/>
             <w:numPr>
+              <w:ilvl w:val="2"/>
               <w:numId w:val="0"/>
             </w:numPr>
             <w:shd w:val="clear" w:fill="F5F5F5"/>
@@ -6250,6 +6485,7 @@
           <w:pPr>
             <w:pStyle w:val="43"/>
             <w:numPr>
+              <w:ilvl w:val="2"/>
               <w:numId w:val="0"/>
             </w:numPr>
             <w:shd w:val="clear" w:fill="F5F5F5"/>
@@ -6286,6 +6522,7 @@
           <w:pPr>
             <w:pStyle w:val="43"/>
             <w:numPr>
+              <w:ilvl w:val="2"/>
               <w:numId w:val="0"/>
             </w:numPr>
             <w:shd w:val="clear" w:fill="F5F5F5"/>
@@ -6322,6 +6559,7 @@
           <w:pPr>
             <w:pStyle w:val="43"/>
             <w:numPr>
+              <w:ilvl w:val="2"/>
               <w:numId w:val="0"/>
             </w:numPr>
             <w:shd w:val="clear" w:fill="F5F5F5"/>
@@ -6449,6 +6687,7 @@
           <w:pPr>
             <w:pStyle w:val="43"/>
             <w:numPr>
+              <w:ilvl w:val="2"/>
               <w:numId w:val="0"/>
             </w:numPr>
             <w:shd w:val="clear" w:fill="F5F5F5"/>
@@ -6485,6 +6724,7 @@
           <w:pPr>
             <w:pStyle w:val="43"/>
             <w:numPr>
+              <w:ilvl w:val="2"/>
               <w:numId w:val="0"/>
             </w:numPr>
             <w:shd w:val="clear" w:fill="F5F5F5"/>
@@ -6521,6 +6761,7 @@
           <w:pPr>
             <w:pStyle w:val="43"/>
             <w:numPr>
+              <w:ilvl w:val="2"/>
               <w:numId w:val="0"/>
             </w:numPr>
             <w:shd w:val="clear" w:fill="F5F5F5"/>
@@ -6557,6 +6798,7 @@
           <w:pPr>
             <w:pStyle w:val="43"/>
             <w:numPr>
+              <w:ilvl w:val="2"/>
               <w:numId w:val="0"/>
             </w:numPr>
             <w:shd w:val="clear" w:fill="F5F5F5"/>
@@ -6593,6 +6835,7 @@
           <w:pPr>
             <w:pStyle w:val="43"/>
             <w:numPr>
+              <w:ilvl w:val="2"/>
               <w:numId w:val="0"/>
             </w:numPr>
             <w:shd w:val="clear" w:fill="F5F5F5"/>
@@ -6629,6 +6872,7 @@
           <w:pPr>
             <w:pStyle w:val="43"/>
             <w:numPr>
+              <w:ilvl w:val="2"/>
               <w:numId w:val="0"/>
             </w:numPr>
             <w:shd w:val="clear" w:fill="F5F5F5"/>
@@ -6665,6 +6909,7 @@
           <w:pPr>
             <w:pStyle w:val="43"/>
             <w:numPr>
+              <w:ilvl w:val="2"/>
               <w:numId w:val="0"/>
             </w:numPr>
             <w:shd w:val="clear" w:fill="F5F5F5"/>
@@ -6701,6 +6946,7 @@
           <w:pPr>
             <w:pStyle w:val="43"/>
             <w:numPr>
+              <w:ilvl w:val="2"/>
               <w:numId w:val="0"/>
             </w:numPr>
             <w:shd w:val="clear" w:fill="F5F5F5"/>
@@ -6932,6 +7178,7 @@
           <w:pPr>
             <w:pStyle w:val="43"/>
             <w:numPr>
+              <w:ilvl w:val="2"/>
               <w:numId w:val="0"/>
             </w:numPr>
             <w:shd w:val="clear" w:fill="F5F5F5"/>
@@ -6955,6 +7202,7 @@
           <w:pPr>
             <w:pStyle w:val="43"/>
             <w:numPr>
+              <w:ilvl w:val="2"/>
               <w:numId w:val="0"/>
             </w:numPr>
             <w:shd w:val="clear" w:fill="F5F5F5"/>
@@ -6991,6 +7239,7 @@
           <w:pPr>
             <w:pStyle w:val="43"/>
             <w:numPr>
+              <w:ilvl w:val="2"/>
               <w:numId w:val="0"/>
             </w:numPr>
             <w:shd w:val="clear" w:fill="F5F5F5"/>
@@ -7027,6 +7276,7 @@
           <w:pPr>
             <w:pStyle w:val="43"/>
             <w:numPr>
+              <w:ilvl w:val="2"/>
               <w:numId w:val="0"/>
             </w:numPr>
             <w:shd w:val="clear" w:fill="F5F5F5"/>
@@ -7063,6 +7313,7 @@
           <w:pPr>
             <w:pStyle w:val="43"/>
             <w:numPr>
+              <w:ilvl w:val="2"/>
               <w:numId w:val="0"/>
             </w:numPr>
             <w:shd w:val="clear" w:fill="F5F5F5"/>
@@ -7099,6 +7350,7 @@
           <w:pPr>
             <w:pStyle w:val="43"/>
             <w:numPr>
+              <w:ilvl w:val="2"/>
               <w:numId w:val="0"/>
             </w:numPr>
             <w:shd w:val="clear" w:fill="F5F5F5"/>
@@ -7135,6 +7387,7 @@
           <w:pPr>
             <w:pStyle w:val="43"/>
             <w:numPr>
+              <w:ilvl w:val="2"/>
               <w:numId w:val="0"/>
             </w:numPr>
             <w:shd w:val="clear" w:fill="F5F5F5"/>
@@ -7236,6 +7489,7 @@
           <w:pPr>
             <w:pStyle w:val="43"/>
             <w:numPr>
+              <w:ilvl w:val="2"/>
               <w:numId w:val="0"/>
             </w:numPr>
             <w:shd w:val="clear" w:fill="F5F5F5"/>
@@ -7272,6 +7526,7 @@
           <w:pPr>
             <w:pStyle w:val="43"/>
             <w:numPr>
+              <w:ilvl w:val="2"/>
               <w:numId w:val="0"/>
             </w:numPr>
             <w:shd w:val="clear" w:fill="F5F5F5"/>
@@ -7308,6 +7563,7 @@
           <w:pPr>
             <w:pStyle w:val="43"/>
             <w:numPr>
+              <w:ilvl w:val="2"/>
               <w:numId w:val="0"/>
             </w:numPr>
             <w:shd w:val="clear" w:fill="F5F5F5"/>
@@ -7344,6 +7600,7 @@
           <w:pPr>
             <w:pStyle w:val="43"/>
             <w:numPr>
+              <w:ilvl w:val="2"/>
               <w:numId w:val="0"/>
             </w:numPr>
             <w:shd w:val="clear" w:fill="F5F5F5"/>
@@ -7380,6 +7637,7 @@
           <w:pPr>
             <w:pStyle w:val="43"/>
             <w:numPr>
+              <w:ilvl w:val="2"/>
               <w:numId w:val="0"/>
             </w:numPr>
             <w:shd w:val="clear" w:fill="F5F5F5"/>
@@ -7416,6 +7674,7 @@
           <w:pPr>
             <w:pStyle w:val="43"/>
             <w:numPr>
+              <w:ilvl w:val="2"/>
               <w:numId w:val="0"/>
             </w:numPr>
             <w:shd w:val="clear" w:fill="F5F5F5"/>
@@ -7517,6 +7776,7 @@
           <w:pPr>
             <w:pStyle w:val="43"/>
             <w:numPr>
+              <w:ilvl w:val="2"/>
               <w:numId w:val="0"/>
             </w:numPr>
             <w:shd w:val="clear" w:fill="F5F5F5"/>
@@ -7540,6 +7800,7 @@
           <w:pPr>
             <w:pStyle w:val="43"/>
             <w:numPr>
+              <w:ilvl w:val="2"/>
               <w:numId w:val="0"/>
             </w:numPr>
             <w:shd w:val="clear" w:fill="F5F5F5"/>
@@ -7576,6 +7837,7 @@
           <w:pPr>
             <w:pStyle w:val="43"/>
             <w:numPr>
+              <w:ilvl w:val="2"/>
               <w:numId w:val="0"/>
             </w:numPr>
             <w:shd w:val="clear" w:fill="F5F5F5"/>
@@ -7612,6 +7874,7 @@
           <w:pPr>
             <w:pStyle w:val="43"/>
             <w:numPr>
+              <w:ilvl w:val="2"/>
               <w:numId w:val="0"/>
             </w:numPr>
             <w:shd w:val="clear" w:fill="F5F5F5"/>
@@ -7648,6 +7911,7 @@
           <w:pPr>
             <w:pStyle w:val="43"/>
             <w:numPr>
+              <w:ilvl w:val="2"/>
               <w:numId w:val="0"/>
             </w:numPr>
             <w:shd w:val="clear" w:fill="F5F5F5"/>
@@ -7684,6 +7948,7 @@
           <w:pPr>
             <w:pStyle w:val="43"/>
             <w:numPr>
+              <w:ilvl w:val="2"/>
               <w:numId w:val="0"/>
             </w:numPr>
             <w:shd w:val="clear" w:fill="F5F5F5"/>
@@ -7746,6 +8011,7 @@
           <w:pPr>
             <w:pStyle w:val="43"/>
             <w:numPr>
+              <w:ilvl w:val="2"/>
               <w:numId w:val="0"/>
             </w:numPr>
             <w:shd w:val="clear" w:fill="F5F5F5"/>
@@ -7782,6 +8048,7 @@
           <w:pPr>
             <w:pStyle w:val="43"/>
             <w:numPr>
+              <w:ilvl w:val="2"/>
               <w:numId w:val="0"/>
             </w:numPr>
             <w:shd w:val="clear" w:fill="F5F5F5"/>
@@ -7909,6 +8176,7 @@
           <w:pPr>
             <w:pStyle w:val="43"/>
             <w:numPr>
+              <w:ilvl w:val="2"/>
               <w:numId w:val="0"/>
             </w:numPr>
             <w:shd w:val="clear" w:fill="F5F5F5"/>
@@ -7932,6 +8200,7 @@
           <w:pPr>
             <w:pStyle w:val="43"/>
             <w:numPr>
+              <w:ilvl w:val="2"/>
               <w:numId w:val="0"/>
             </w:numPr>
             <w:shd w:val="clear" w:fill="F5F5F5"/>
@@ -7968,6 +8237,7 @@
           <w:pPr>
             <w:pStyle w:val="43"/>
             <w:numPr>
+              <w:ilvl w:val="2"/>
               <w:numId w:val="0"/>
             </w:numPr>
             <w:shd w:val="clear" w:fill="F5F5F5"/>
@@ -8004,6 +8274,7 @@
           <w:pPr>
             <w:pStyle w:val="43"/>
             <w:numPr>
+              <w:ilvl w:val="2"/>
               <w:numId w:val="0"/>
             </w:numPr>
             <w:shd w:val="clear" w:fill="F5F5F5"/>
@@ -8040,6 +8311,7 @@
           <w:pPr>
             <w:pStyle w:val="43"/>
             <w:numPr>
+              <w:ilvl w:val="2"/>
               <w:numId w:val="0"/>
             </w:numPr>
             <w:shd w:val="clear" w:fill="F5F5F5"/>
@@ -8076,6 +8348,7 @@
           <w:pPr>
             <w:pStyle w:val="43"/>
             <w:numPr>
+              <w:ilvl w:val="2"/>
               <w:numId w:val="0"/>
             </w:numPr>
             <w:shd w:val="clear" w:fill="F5F5F5"/>
@@ -8112,6 +8385,7 @@
           <w:pPr>
             <w:pStyle w:val="43"/>
             <w:numPr>
+              <w:ilvl w:val="2"/>
               <w:numId w:val="0"/>
             </w:numPr>
             <w:shd w:val="clear" w:fill="F5F5F5"/>
@@ -8239,6 +8513,7 @@
           <w:pPr>
             <w:pStyle w:val="43"/>
             <w:numPr>
+              <w:ilvl w:val="2"/>
               <w:numId w:val="0"/>
             </w:numPr>
             <w:shd w:val="clear" w:fill="F5F5F5"/>
@@ -8262,6 +8537,7 @@
           <w:pPr>
             <w:pStyle w:val="43"/>
             <w:numPr>
+              <w:ilvl w:val="2"/>
               <w:numId w:val="0"/>
             </w:numPr>
             <w:shd w:val="clear" w:fill="F5F5F5"/>
@@ -8298,6 +8574,7 @@
           <w:pPr>
             <w:pStyle w:val="43"/>
             <w:numPr>
+              <w:ilvl w:val="2"/>
               <w:numId w:val="0"/>
             </w:numPr>
             <w:shd w:val="clear" w:fill="F5F5F5"/>
@@ -8334,6 +8611,7 @@
           <w:pPr>
             <w:pStyle w:val="43"/>
             <w:numPr>
+              <w:ilvl w:val="2"/>
               <w:numId w:val="0"/>
             </w:numPr>
             <w:shd w:val="clear" w:fill="F5F5F5"/>
@@ -8370,6 +8648,7 @@
           <w:pPr>
             <w:pStyle w:val="43"/>
             <w:numPr>
+              <w:ilvl w:val="2"/>
               <w:numId w:val="0"/>
             </w:numPr>
             <w:shd w:val="clear" w:fill="F5F5F5"/>
@@ -8406,6 +8685,7 @@
           <w:pPr>
             <w:pStyle w:val="43"/>
             <w:numPr>
+              <w:ilvl w:val="2"/>
               <w:numId w:val="0"/>
             </w:numPr>
             <w:shd w:val="clear" w:fill="F5F5F5"/>
@@ -8520,6 +8800,7 @@
           <w:pPr>
             <w:pStyle w:val="43"/>
             <w:numPr>
+              <w:ilvl w:val="2"/>
               <w:numId w:val="0"/>
             </w:numPr>
             <w:shd w:val="clear" w:fill="F5F5F5"/>
@@ -8556,6 +8837,7 @@
           <w:pPr>
             <w:pStyle w:val="43"/>
             <w:numPr>
+              <w:ilvl w:val="2"/>
               <w:numId w:val="0"/>
             </w:numPr>
             <w:shd w:val="clear" w:fill="F5F5F5"/>
@@ -8592,6 +8874,7 @@
           <w:pPr>
             <w:pStyle w:val="43"/>
             <w:numPr>
+              <w:ilvl w:val="2"/>
               <w:numId w:val="0"/>
             </w:numPr>
             <w:shd w:val="clear" w:fill="F5F5F5"/>
@@ -8613,6 +8896,7 @@
       <w:pPr>
         <w:pStyle w:val="42"/>
         <w:numPr>
+          <w:ilvl w:val="1"/>
           <w:numId w:val="0"/>
         </w:numPr>
         <w:bidi w:val="0"/>
@@ -8682,6 +8966,7 @@
           <w:pPr>
             <w:pStyle w:val="42"/>
             <w:numPr>
+              <w:ilvl w:val="1"/>
               <w:numId w:val="0"/>
             </w:numPr>
             <w:shd w:val="clear" w:fill="F5F5F5"/>
@@ -8745,6 +9030,7 @@
           <w:pPr>
             <w:pStyle w:val="42"/>
             <w:numPr>
+              <w:ilvl w:val="1"/>
               <w:numId w:val="0"/>
             </w:numPr>
             <w:shd w:val="clear" w:fill="F5F5F5"/>
@@ -8769,6 +9055,7 @@
           <w:pPr>
             <w:pStyle w:val="42"/>
             <w:numPr>
+              <w:ilvl w:val="1"/>
               <w:numId w:val="0"/>
             </w:numPr>
             <w:shd w:val="clear" w:fill="F5F5F5"/>
@@ -8806,6 +9093,7 @@
           <w:pPr>
             <w:pStyle w:val="42"/>
             <w:numPr>
+              <w:ilvl w:val="1"/>
               <w:numId w:val="0"/>
             </w:numPr>
             <w:shd w:val="clear" w:fill="F5F5F5"/>
@@ -9051,6 +9339,7 @@
           <w:pPr>
             <w:pStyle w:val="42"/>
             <w:numPr>
+              <w:ilvl w:val="1"/>
               <w:numId w:val="0"/>
             </w:numPr>
             <w:shd w:val="clear" w:fill="F5F5F5"/>
@@ -9075,6 +9364,7 @@
           <w:pPr>
             <w:pStyle w:val="42"/>
             <w:numPr>
+              <w:ilvl w:val="1"/>
               <w:numId w:val="0"/>
             </w:numPr>
             <w:shd w:val="clear" w:fill="F5F5F5"/>
@@ -9112,6 +9402,7 @@
           <w:pPr>
             <w:pStyle w:val="42"/>
             <w:numPr>
+              <w:ilvl w:val="1"/>
               <w:numId w:val="0"/>
             </w:numPr>
             <w:shd w:val="clear" w:fill="F5F5F5"/>
@@ -9266,6 +9557,7 @@
           <w:pPr>
             <w:pStyle w:val="42"/>
             <w:numPr>
+              <w:ilvl w:val="1"/>
               <w:numId w:val="0"/>
             </w:numPr>
             <w:shd w:val="clear" w:fill="F5F5F5"/>
@@ -9303,6 +9595,7 @@
           <w:pPr>
             <w:pStyle w:val="42"/>
             <w:numPr>
+              <w:ilvl w:val="1"/>
               <w:numId w:val="0"/>
             </w:numPr>
             <w:shd w:val="clear" w:fill="F5F5F5"/>
@@ -9418,6 +9711,7 @@
           <w:pPr>
             <w:pStyle w:val="42"/>
             <w:numPr>
+              <w:ilvl w:val="1"/>
               <w:numId w:val="0"/>
             </w:numPr>
             <w:shd w:val="clear" w:fill="F5F5F5"/>
@@ -9611,6 +9905,7 @@
           <w:pPr>
             <w:pStyle w:val="42"/>
             <w:numPr>
+              <w:ilvl w:val="1"/>
               <w:numId w:val="0"/>
             </w:numPr>
             <w:shd w:val="clear" w:fill="F5F5F5"/>
@@ -9700,6 +9995,7 @@
           <w:pPr>
             <w:pStyle w:val="42"/>
             <w:numPr>
+              <w:ilvl w:val="1"/>
               <w:numId w:val="0"/>
             </w:numPr>
             <w:shd w:val="clear" w:fill="F5F5F5"/>
@@ -9737,6 +10033,7 @@
           <w:pPr>
             <w:pStyle w:val="42"/>
             <w:numPr>
+              <w:ilvl w:val="1"/>
               <w:numId w:val="0"/>
             </w:numPr>
             <w:shd w:val="clear" w:fill="F5F5F5"/>
@@ -9761,6 +10058,7 @@
           <w:pPr>
             <w:pStyle w:val="42"/>
             <w:numPr>
+              <w:ilvl w:val="1"/>
               <w:numId w:val="0"/>
             </w:numPr>
             <w:shd w:val="clear" w:fill="F5F5F5"/>
@@ -9798,6 +10096,7 @@
           <w:pPr>
             <w:pStyle w:val="42"/>
             <w:numPr>
+              <w:ilvl w:val="1"/>
               <w:numId w:val="0"/>
             </w:numPr>
             <w:shd w:val="clear" w:fill="F5F5F5"/>
@@ -9835,6 +10134,7 @@
           <w:pPr>
             <w:pStyle w:val="42"/>
             <w:numPr>
+              <w:ilvl w:val="1"/>
               <w:numId w:val="0"/>
             </w:numPr>
             <w:shd w:val="clear" w:fill="F5F5F5"/>
@@ -9872,6 +10172,7 @@
           <w:pPr>
             <w:pStyle w:val="42"/>
             <w:numPr>
+              <w:ilvl w:val="1"/>
               <w:numId w:val="0"/>
             </w:numPr>
             <w:shd w:val="clear" w:fill="F5F5F5"/>
@@ -9974,6 +10275,7 @@
           <w:pPr>
             <w:pStyle w:val="42"/>
             <w:numPr>
+              <w:ilvl w:val="1"/>
               <w:numId w:val="0"/>
             </w:numPr>
             <w:shd w:val="clear" w:fill="F5F5F5"/>
@@ -10011,6 +10313,7 @@
           <w:pPr>
             <w:pStyle w:val="42"/>
             <w:numPr>
+              <w:ilvl w:val="1"/>
               <w:numId w:val="0"/>
             </w:numPr>
             <w:shd w:val="clear" w:fill="F5F5F5"/>
@@ -10048,6 +10351,7 @@
           <w:pPr>
             <w:pStyle w:val="42"/>
             <w:numPr>
+              <w:ilvl w:val="1"/>
               <w:numId w:val="0"/>
             </w:numPr>
             <w:shd w:val="clear" w:fill="F5F5F5"/>
@@ -10228,6 +10532,7 @@
           <w:pPr>
             <w:pStyle w:val="42"/>
             <w:numPr>
+              <w:ilvl w:val="1"/>
               <w:numId w:val="0"/>
             </w:numPr>
             <w:shd w:val="clear" w:fill="F5F5F5"/>
@@ -10265,6 +10570,7 @@
           <w:pPr>
             <w:pStyle w:val="42"/>
             <w:numPr>
+              <w:ilvl w:val="1"/>
               <w:numId w:val="0"/>
             </w:numPr>
             <w:shd w:val="clear" w:fill="F5F5F5"/>
@@ -10354,6 +10660,7 @@
           <w:pPr>
             <w:pStyle w:val="42"/>
             <w:numPr>
+              <w:ilvl w:val="1"/>
               <w:numId w:val="0"/>
             </w:numPr>
             <w:shd w:val="clear" w:fill="F5F5F5"/>
@@ -10378,6 +10685,7 @@
           <w:pPr>
             <w:pStyle w:val="42"/>
             <w:numPr>
+              <w:ilvl w:val="1"/>
               <w:numId w:val="0"/>
             </w:numPr>
             <w:shd w:val="clear" w:fill="F5F5F5"/>
@@ -10441,6 +10749,7 @@
           <w:pPr>
             <w:pStyle w:val="42"/>
             <w:numPr>
+              <w:ilvl w:val="1"/>
               <w:numId w:val="0"/>
             </w:numPr>
             <w:shd w:val="clear" w:fill="F5F5F5"/>
@@ -10556,6 +10865,7 @@
           <w:pPr>
             <w:pStyle w:val="42"/>
             <w:numPr>
+              <w:ilvl w:val="1"/>
               <w:numId w:val="0"/>
             </w:numPr>
             <w:shd w:val="clear" w:fill="F5F5F5"/>
@@ -10645,6 +10955,7 @@
           <w:pPr>
             <w:pStyle w:val="42"/>
             <w:numPr>
+              <w:ilvl w:val="1"/>
               <w:numId w:val="0"/>
             </w:numPr>
             <w:shd w:val="clear" w:fill="F5F5F5"/>
@@ -10708,6 +11019,7 @@
           <w:pPr>
             <w:pStyle w:val="42"/>
             <w:numPr>
+              <w:ilvl w:val="1"/>
               <w:numId w:val="0"/>
             </w:numPr>
             <w:shd w:val="clear" w:fill="F5F5F5"/>
@@ -10732,6 +11044,7 @@
           <w:pPr>
             <w:pStyle w:val="42"/>
             <w:numPr>
+              <w:ilvl w:val="1"/>
               <w:numId w:val="0"/>
             </w:numPr>
             <w:shd w:val="clear" w:fill="F5F5F5"/>
@@ -10821,6 +11134,7 @@
           <w:pPr>
             <w:pStyle w:val="42"/>
             <w:numPr>
+              <w:ilvl w:val="1"/>
               <w:numId w:val="0"/>
             </w:numPr>
             <w:shd w:val="clear" w:fill="F5F5F5"/>
@@ -10858,6 +11172,7 @@
           <w:pPr>
             <w:pStyle w:val="42"/>
             <w:numPr>
+              <w:ilvl w:val="1"/>
               <w:numId w:val="0"/>
             </w:numPr>
             <w:shd w:val="clear" w:fill="F5F5F5"/>
@@ -10882,6 +11197,7 @@
           <w:pPr>
             <w:pStyle w:val="42"/>
             <w:numPr>
+              <w:ilvl w:val="1"/>
               <w:numId w:val="0"/>
             </w:numPr>
             <w:shd w:val="clear" w:fill="F5F5F5"/>
@@ -10919,6 +11235,7 @@
           <w:pPr>
             <w:pStyle w:val="42"/>
             <w:numPr>
+              <w:ilvl w:val="1"/>
               <w:numId w:val="0"/>
             </w:numPr>
             <w:shd w:val="clear" w:fill="F5F5F5"/>
@@ -10956,6 +11273,7 @@
           <w:pPr>
             <w:pStyle w:val="42"/>
             <w:numPr>
+              <w:ilvl w:val="1"/>
               <w:numId w:val="0"/>
             </w:numPr>
             <w:shd w:val="clear" w:fill="F5F5F5"/>
@@ -10993,6 +11311,7 @@
           <w:pPr>
             <w:pStyle w:val="42"/>
             <w:numPr>
+              <w:ilvl w:val="1"/>
               <w:numId w:val="0"/>
             </w:numPr>
             <w:shd w:val="clear" w:fill="F5F5F5"/>
@@ -11095,6 +11414,7 @@
           <w:pPr>
             <w:pStyle w:val="42"/>
             <w:numPr>
+              <w:ilvl w:val="1"/>
               <w:numId w:val="0"/>
             </w:numPr>
             <w:shd w:val="clear" w:fill="F5F5F5"/>
@@ -11197,6 +11517,7 @@
           <w:pPr>
             <w:pStyle w:val="42"/>
             <w:numPr>
+              <w:ilvl w:val="1"/>
               <w:numId w:val="0"/>
             </w:numPr>
             <w:shd w:val="clear" w:fill="F5F5F5"/>
@@ -11234,6 +11555,7 @@
           <w:pPr>
             <w:pStyle w:val="42"/>
             <w:numPr>
+              <w:ilvl w:val="1"/>
               <w:numId w:val="0"/>
             </w:numPr>
             <w:shd w:val="clear" w:fill="F5F5F5"/>
@@ -11271,6 +11593,7 @@
           <w:pPr>
             <w:pStyle w:val="42"/>
             <w:numPr>
+              <w:ilvl w:val="1"/>
               <w:numId w:val="0"/>
             </w:numPr>
             <w:shd w:val="clear" w:fill="F5F5F5"/>
@@ -11529,6 +11852,7 @@
           <w:pPr>
             <w:pStyle w:val="42"/>
             <w:numPr>
+              <w:ilvl w:val="1"/>
               <w:numId w:val="0"/>
             </w:numPr>
             <w:shd w:val="clear" w:fill="F5F5F5"/>
@@ -11566,6 +11890,7 @@
           <w:pPr>
             <w:pStyle w:val="42"/>
             <w:numPr>
+              <w:ilvl w:val="1"/>
               <w:numId w:val="0"/>
             </w:numPr>
             <w:shd w:val="clear" w:fill="F5F5F5"/>
@@ -11681,6 +12006,7 @@
           <w:pPr>
             <w:pStyle w:val="42"/>
             <w:numPr>
+              <w:ilvl w:val="1"/>
               <w:numId w:val="0"/>
             </w:numPr>
             <w:shd w:val="clear" w:fill="F5F5F5"/>
@@ -11705,6 +12031,7 @@
           <w:pPr>
             <w:pStyle w:val="42"/>
             <w:numPr>
+              <w:ilvl w:val="1"/>
               <w:numId w:val="0"/>
             </w:numPr>
             <w:shd w:val="clear" w:fill="F5F5F5"/>
@@ -11768,6 +12095,7 @@
           <w:pPr>
             <w:pStyle w:val="42"/>
             <w:numPr>
+              <w:ilvl w:val="1"/>
               <w:numId w:val="0"/>
             </w:numPr>
             <w:shd w:val="clear" w:fill="F5F5F5"/>
@@ -11883,6 +12211,7 @@
           <w:pPr>
             <w:pStyle w:val="42"/>
             <w:numPr>
+              <w:ilvl w:val="1"/>
               <w:numId w:val="0"/>
             </w:numPr>
             <w:shd w:val="clear" w:fill="F5F5F5"/>
@@ -12076,6 +12405,7 @@
           <w:pPr>
             <w:pStyle w:val="42"/>
             <w:numPr>
+              <w:ilvl w:val="1"/>
               <w:numId w:val="0"/>
             </w:numPr>
             <w:shd w:val="clear" w:fill="F5F5F5"/>
@@ -12126,6 +12456,7 @@
           <w:pPr>
             <w:pStyle w:val="42"/>
             <w:numPr>
+              <w:ilvl w:val="1"/>
               <w:numId w:val="0"/>
             </w:numPr>
             <w:shd w:val="clear" w:fill="F5F5F5"/>
@@ -12228,6 +12559,7 @@
           <w:pPr>
             <w:pStyle w:val="42"/>
             <w:numPr>
+              <w:ilvl w:val="1"/>
               <w:numId w:val="0"/>
             </w:numPr>
             <w:shd w:val="clear" w:fill="F5F5F5"/>
@@ -12278,6 +12610,7 @@
           <w:pPr>
             <w:pStyle w:val="42"/>
             <w:numPr>
+              <w:ilvl w:val="1"/>
               <w:numId w:val="0"/>
             </w:numPr>
             <w:shd w:val="clear" w:fill="F5F5F5"/>
@@ -12302,6 +12635,7 @@
           <w:pPr>
             <w:pStyle w:val="42"/>
             <w:numPr>
+              <w:ilvl w:val="1"/>
               <w:numId w:val="0"/>
             </w:numPr>
             <w:shd w:val="clear" w:fill="F5F5F5"/>
@@ -12365,6 +12699,7 @@
           <w:pPr>
             <w:pStyle w:val="42"/>
             <w:numPr>
+              <w:ilvl w:val="1"/>
               <w:numId w:val="0"/>
             </w:numPr>
             <w:shd w:val="clear" w:fill="F5F5F5"/>
@@ -12389,6 +12724,7 @@
           <w:pPr>
             <w:pStyle w:val="42"/>
             <w:numPr>
+              <w:ilvl w:val="1"/>
               <w:numId w:val="0"/>
             </w:numPr>
             <w:shd w:val="clear" w:fill="F5F5F5"/>
@@ -12478,6 +12814,7 @@
           <w:pPr>
             <w:pStyle w:val="42"/>
             <w:numPr>
+              <w:ilvl w:val="1"/>
               <w:numId w:val="0"/>
             </w:numPr>
             <w:shd w:val="clear" w:fill="F5F5F5"/>
@@ -12515,6 +12852,7 @@
           <w:pPr>
             <w:pStyle w:val="42"/>
             <w:numPr>
+              <w:ilvl w:val="1"/>
               <w:numId w:val="0"/>
             </w:numPr>
             <w:shd w:val="clear" w:fill="F5F5F5"/>
@@ -12539,6 +12877,7 @@
           <w:pPr>
             <w:pStyle w:val="42"/>
             <w:numPr>
+              <w:ilvl w:val="1"/>
               <w:numId w:val="0"/>
             </w:numPr>
             <w:shd w:val="clear" w:fill="F5F5F5"/>
@@ -12576,6 +12915,7 @@
           <w:pPr>
             <w:pStyle w:val="42"/>
             <w:numPr>
+              <w:ilvl w:val="1"/>
               <w:numId w:val="0"/>
             </w:numPr>
             <w:shd w:val="clear" w:fill="F5F5F5"/>
@@ -12613,6 +12953,7 @@
           <w:pPr>
             <w:pStyle w:val="42"/>
             <w:numPr>
+              <w:ilvl w:val="1"/>
               <w:numId w:val="0"/>
             </w:numPr>
             <w:shd w:val="clear" w:fill="F5F5F5"/>
@@ -12650,6 +12991,7 @@
           <w:pPr>
             <w:pStyle w:val="42"/>
             <w:numPr>
+              <w:ilvl w:val="1"/>
               <w:numId w:val="0"/>
             </w:numPr>
             <w:shd w:val="clear" w:fill="F5F5F5"/>
@@ -12687,6 +13029,7 @@
           <w:pPr>
             <w:pStyle w:val="42"/>
             <w:numPr>
+              <w:ilvl w:val="1"/>
               <w:numId w:val="0"/>
             </w:numPr>
             <w:shd w:val="clear" w:fill="F5F5F5"/>
@@ -12724,6 +13067,7 @@
           <w:pPr>
             <w:pStyle w:val="42"/>
             <w:numPr>
+              <w:ilvl w:val="1"/>
               <w:numId w:val="0"/>
             </w:numPr>
             <w:shd w:val="clear" w:fill="F5F5F5"/>
@@ -12852,6 +13196,7 @@
           <w:pPr>
             <w:pStyle w:val="42"/>
             <w:numPr>
+              <w:ilvl w:val="1"/>
               <w:numId w:val="0"/>
             </w:numPr>
             <w:shd w:val="clear" w:fill="F5F5F5"/>
@@ -12889,6 +13234,7 @@
           <w:pPr>
             <w:pStyle w:val="42"/>
             <w:numPr>
+              <w:ilvl w:val="1"/>
               <w:numId w:val="0"/>
             </w:numPr>
             <w:shd w:val="clear" w:fill="F5F5F5"/>
@@ -12978,6 +13324,7 @@
           <w:pPr>
             <w:pStyle w:val="42"/>
             <w:numPr>
+              <w:ilvl w:val="1"/>
               <w:numId w:val="0"/>
             </w:numPr>
             <w:shd w:val="clear" w:fill="F5F5F5"/>
@@ -13002,6 +13349,7 @@
           <w:pPr>
             <w:pStyle w:val="42"/>
             <w:numPr>
+              <w:ilvl w:val="1"/>
               <w:numId w:val="0"/>
             </w:numPr>
             <w:shd w:val="clear" w:fill="F5F5F5"/>
@@ -13065,6 +13413,7 @@
           <w:pPr>
             <w:pStyle w:val="42"/>
             <w:numPr>
+              <w:ilvl w:val="1"/>
               <w:numId w:val="0"/>
             </w:numPr>
             <w:shd w:val="clear" w:fill="F5F5F5"/>
@@ -13154,6 +13503,7 @@
           <w:pPr>
             <w:pStyle w:val="42"/>
             <w:numPr>
+              <w:ilvl w:val="1"/>
               <w:numId w:val="0"/>
             </w:numPr>
             <w:shd w:val="clear" w:fill="F5F5F5"/>
@@ -13269,6 +13619,7 @@
           <w:pPr>
             <w:pStyle w:val="42"/>
             <w:numPr>
+              <w:ilvl w:val="1"/>
               <w:numId w:val="0"/>
             </w:numPr>
             <w:shd w:val="clear" w:fill="F5F5F5"/>
@@ -13332,6 +13683,7 @@
           <w:pPr>
             <w:pStyle w:val="42"/>
             <w:numPr>
+              <w:ilvl w:val="1"/>
               <w:numId w:val="0"/>
             </w:numPr>
             <w:shd w:val="clear" w:fill="F5F5F5"/>
@@ -13356,6 +13708,7 @@
           <w:pPr>
             <w:pStyle w:val="42"/>
             <w:numPr>
+              <w:ilvl w:val="1"/>
               <w:numId w:val="0"/>
             </w:numPr>
             <w:shd w:val="clear" w:fill="F5F5F5"/>
@@ -13445,6 +13798,7 @@
           <w:pPr>
             <w:pStyle w:val="42"/>
             <w:numPr>
+              <w:ilvl w:val="1"/>
               <w:numId w:val="0"/>
             </w:numPr>
             <w:shd w:val="clear" w:fill="F5F5F5"/>
@@ -13482,6 +13836,7 @@
           <w:pPr>
             <w:pStyle w:val="42"/>
             <w:numPr>
+              <w:ilvl w:val="1"/>
               <w:numId w:val="0"/>
             </w:numPr>
             <w:shd w:val="clear" w:fill="F5F5F5"/>
@@ -13506,6 +13861,7 @@
           <w:pPr>
             <w:pStyle w:val="42"/>
             <w:numPr>
+              <w:ilvl w:val="1"/>
               <w:numId w:val="0"/>
             </w:numPr>
             <w:shd w:val="clear" w:fill="F5F5F5"/>
@@ -13543,6 +13899,7 @@
           <w:pPr>
             <w:pStyle w:val="42"/>
             <w:numPr>
+              <w:ilvl w:val="1"/>
               <w:numId w:val="0"/>
             </w:numPr>
             <w:shd w:val="clear" w:fill="F5F5F5"/>
@@ -13580,6 +13937,7 @@
           <w:pPr>
             <w:pStyle w:val="42"/>
             <w:numPr>
+              <w:ilvl w:val="1"/>
               <w:numId w:val="0"/>
             </w:numPr>
             <w:shd w:val="clear" w:fill="F5F5F5"/>
@@ -13617,6 +13975,7 @@
           <w:pPr>
             <w:pStyle w:val="42"/>
             <w:numPr>
+              <w:ilvl w:val="1"/>
               <w:numId w:val="0"/>
             </w:numPr>
             <w:shd w:val="clear" w:fill="F5F5F5"/>
@@ -13719,6 +14078,7 @@
           <w:pPr>
             <w:pStyle w:val="42"/>
             <w:numPr>
+              <w:ilvl w:val="1"/>
               <w:numId w:val="0"/>
             </w:numPr>
             <w:shd w:val="clear" w:fill="F5F5F5"/>
@@ -13821,6 +14181,7 @@
           <w:pPr>
             <w:pStyle w:val="42"/>
             <w:numPr>
+              <w:ilvl w:val="1"/>
               <w:numId w:val="0"/>
             </w:numPr>
             <w:shd w:val="clear" w:fill="F5F5F5"/>
@@ -13858,6 +14219,7 @@
           <w:pPr>
             <w:pStyle w:val="42"/>
             <w:numPr>
+              <w:ilvl w:val="1"/>
               <w:numId w:val="0"/>
             </w:numPr>
             <w:shd w:val="clear" w:fill="F5F5F5"/>
@@ -13895,6 +14257,7 @@
           <w:pPr>
             <w:pStyle w:val="42"/>
             <w:numPr>
+              <w:ilvl w:val="1"/>
               <w:numId w:val="0"/>
             </w:numPr>
             <w:shd w:val="clear" w:fill="F5F5F5"/>
@@ -14127,6 +14490,7 @@
           <w:pPr>
             <w:pStyle w:val="42"/>
             <w:numPr>
+              <w:ilvl w:val="1"/>
               <w:numId w:val="0"/>
             </w:numPr>
             <w:shd w:val="clear" w:fill="F5F5F5"/>
@@ -14164,6 +14528,7 @@
           <w:pPr>
             <w:pStyle w:val="42"/>
             <w:numPr>
+              <w:ilvl w:val="1"/>
               <w:numId w:val="0"/>
             </w:numPr>
             <w:shd w:val="clear" w:fill="F5F5F5"/>
@@ -14279,6 +14644,7 @@
           <w:pPr>
             <w:pStyle w:val="42"/>
             <w:numPr>
+              <w:ilvl w:val="1"/>
               <w:numId w:val="0"/>
             </w:numPr>
             <w:shd w:val="clear" w:fill="F5F5F5"/>
@@ -14303,6 +14669,7 @@
           <w:pPr>
             <w:pStyle w:val="42"/>
             <w:numPr>
+              <w:ilvl w:val="1"/>
               <w:numId w:val="0"/>
             </w:numPr>
             <w:shd w:val="clear" w:fill="F5F5F5"/>
@@ -14366,6 +14733,7 @@
           <w:pPr>
             <w:pStyle w:val="42"/>
             <w:numPr>
+              <w:ilvl w:val="1"/>
               <w:numId w:val="0"/>
             </w:numPr>
             <w:shd w:val="clear" w:fill="F5F5F5"/>
@@ -14481,6 +14849,7 @@
           <w:pPr>
             <w:pStyle w:val="42"/>
             <w:numPr>
+              <w:ilvl w:val="1"/>
               <w:numId w:val="0"/>
             </w:numPr>
             <w:shd w:val="clear" w:fill="F5F5F5"/>
@@ -14674,6 +15043,7 @@
           <w:pPr>
             <w:pStyle w:val="42"/>
             <w:numPr>
+              <w:ilvl w:val="1"/>
               <w:numId w:val="0"/>
             </w:numPr>
             <w:shd w:val="clear" w:fill="F5F5F5"/>
@@ -14724,6 +15094,7 @@
           <w:pPr>
             <w:pStyle w:val="42"/>
             <w:numPr>
+              <w:ilvl w:val="1"/>
               <w:numId w:val="0"/>
             </w:numPr>
             <w:shd w:val="clear" w:fill="F5F5F5"/>
@@ -14891,6 +15262,7 @@
           <w:pPr>
             <w:pStyle w:val="42"/>
             <w:numPr>
+              <w:ilvl w:val="1"/>
               <w:numId w:val="0"/>
             </w:numPr>
             <w:shd w:val="clear" w:fill="F5F5F5"/>
@@ -14941,6 +15313,7 @@
           <w:pPr>
             <w:pStyle w:val="42"/>
             <w:numPr>
+              <w:ilvl w:val="1"/>
               <w:numId w:val="0"/>
             </w:numPr>
             <w:shd w:val="clear" w:fill="F5F5F5"/>
@@ -15004,6 +15377,7 @@
           <w:pPr>
             <w:pStyle w:val="42"/>
             <w:numPr>
+              <w:ilvl w:val="1"/>
               <w:numId w:val="0"/>
             </w:numPr>
             <w:shd w:val="clear" w:fill="F5F5F5"/>
@@ -15028,6 +15402,7 @@
           <w:pPr>
             <w:pStyle w:val="42"/>
             <w:numPr>
+              <w:ilvl w:val="1"/>
               <w:numId w:val="0"/>
             </w:numPr>
             <w:shd w:val="clear" w:fill="F5F5F5"/>
@@ -15117,6 +15492,7 @@
           <w:pPr>
             <w:pStyle w:val="42"/>
             <w:numPr>
+              <w:ilvl w:val="1"/>
               <w:numId w:val="0"/>
             </w:numPr>
             <w:shd w:val="clear" w:fill="F5F5F5"/>
@@ -15154,6 +15530,7 @@
           <w:pPr>
             <w:pStyle w:val="42"/>
             <w:numPr>
+              <w:ilvl w:val="1"/>
               <w:numId w:val="0"/>
             </w:numPr>
             <w:shd w:val="clear" w:fill="F5F5F5"/>
@@ -15178,6 +15555,7 @@
           <w:pPr>
             <w:pStyle w:val="42"/>
             <w:numPr>
+              <w:ilvl w:val="1"/>
               <w:numId w:val="0"/>
             </w:numPr>
             <w:shd w:val="clear" w:fill="F5F5F5"/>
@@ -15215,6 +15593,7 @@
           <w:pPr>
             <w:pStyle w:val="42"/>
             <w:numPr>
+              <w:ilvl w:val="1"/>
               <w:numId w:val="0"/>
             </w:numPr>
             <w:shd w:val="clear" w:fill="F5F5F5"/>
@@ -15252,6 +15631,7 @@
           <w:pPr>
             <w:pStyle w:val="42"/>
             <w:numPr>
+              <w:ilvl w:val="1"/>
               <w:numId w:val="0"/>
             </w:numPr>
             <w:shd w:val="clear" w:fill="F5F5F5"/>
@@ -15289,6 +15669,7 @@
           <w:pPr>
             <w:pStyle w:val="42"/>
             <w:numPr>
+              <w:ilvl w:val="1"/>
               <w:numId w:val="0"/>
             </w:numPr>
             <w:shd w:val="clear" w:fill="F5F5F5"/>
@@ -15326,6 +15707,7 @@
           <w:pPr>
             <w:pStyle w:val="42"/>
             <w:numPr>
+              <w:ilvl w:val="1"/>
               <w:numId w:val="0"/>
             </w:numPr>
             <w:shd w:val="clear" w:fill="F5F5F5"/>
@@ -15363,6 +15745,7 @@
           <w:pPr>
             <w:pStyle w:val="42"/>
             <w:numPr>
+              <w:ilvl w:val="1"/>
               <w:numId w:val="0"/>
             </w:numPr>
             <w:shd w:val="clear" w:fill="F5F5F5"/>
@@ -15465,6 +15848,7 @@
           <w:pPr>
             <w:pStyle w:val="42"/>
             <w:numPr>
+              <w:ilvl w:val="1"/>
               <w:numId w:val="0"/>
             </w:numPr>
             <w:shd w:val="clear" w:fill="F5F5F5"/>
@@ -15502,6 +15886,7 @@
           <w:pPr>
             <w:pStyle w:val="42"/>
             <w:numPr>
+              <w:ilvl w:val="1"/>
               <w:numId w:val="0"/>
             </w:numPr>
             <w:shd w:val="clear" w:fill="F5F5F5"/>
@@ -15565,6 +15950,7 @@
           <w:pPr>
             <w:pStyle w:val="42"/>
             <w:numPr>
+              <w:ilvl w:val="1"/>
               <w:numId w:val="0"/>
             </w:numPr>
             <w:shd w:val="clear" w:fill="F5F5F5"/>
@@ -15745,6 +16131,7 @@
           <w:pPr>
             <w:pStyle w:val="42"/>
             <w:numPr>
+              <w:ilvl w:val="1"/>
               <w:numId w:val="0"/>
             </w:numPr>
             <w:shd w:val="clear" w:fill="F5F5F5"/>
@@ -15990,6 +16377,7 @@
           <w:pPr>
             <w:pStyle w:val="42"/>
             <w:numPr>
+              <w:ilvl w:val="1"/>
               <w:numId w:val="0"/>
             </w:numPr>
             <w:shd w:val="clear" w:fill="F5F5F5"/>
@@ -16222,6 +16610,7 @@
           <w:pPr>
             <w:pStyle w:val="42"/>
             <w:numPr>
+              <w:ilvl w:val="1"/>
               <w:numId w:val="0"/>
             </w:numPr>
             <w:shd w:val="clear" w:fill="F5F5F5"/>
@@ -16454,6 +16843,7 @@
           <w:pPr>
             <w:pStyle w:val="42"/>
             <w:numPr>
+              <w:ilvl w:val="1"/>
               <w:numId w:val="0"/>
             </w:numPr>
             <w:shd w:val="clear" w:fill="F5F5F5"/>
@@ -16660,6 +17050,7 @@
           <w:pPr>
             <w:pStyle w:val="42"/>
             <w:numPr>
+              <w:ilvl w:val="1"/>
               <w:numId w:val="0"/>
             </w:numPr>
             <w:shd w:val="clear" w:fill="F5F5F5"/>
@@ -16892,6 +17283,7 @@
           <w:pPr>
             <w:pStyle w:val="42"/>
             <w:numPr>
+              <w:ilvl w:val="1"/>
               <w:numId w:val="0"/>
             </w:numPr>
             <w:shd w:val="clear" w:fill="F5F5F5"/>
@@ -17137,6 +17529,7 @@
           <w:pPr>
             <w:pStyle w:val="42"/>
             <w:numPr>
+              <w:ilvl w:val="1"/>
               <w:numId w:val="0"/>
             </w:numPr>
             <w:shd w:val="clear" w:fill="F5F5F5"/>
@@ -17382,6 +17775,7 @@
           <w:pPr>
             <w:pStyle w:val="42"/>
             <w:numPr>
+              <w:ilvl w:val="1"/>
               <w:numId w:val="0"/>
             </w:numPr>
             <w:shd w:val="clear" w:fill="F5F5F5"/>
@@ -17692,6 +18086,7 @@
           <w:pPr>
             <w:pStyle w:val="42"/>
             <w:numPr>
+              <w:ilvl w:val="1"/>
               <w:numId w:val="0"/>
             </w:numPr>
             <w:shd w:val="clear" w:fill="F5F5F5"/>
@@ -17729,6 +18124,7 @@
           <w:pPr>
             <w:pStyle w:val="42"/>
             <w:numPr>
+              <w:ilvl w:val="1"/>
               <w:numId w:val="0"/>
             </w:numPr>
             <w:shd w:val="clear" w:fill="F5F5F5"/>
@@ -17753,6 +18149,7 @@
           <w:pPr>
             <w:pStyle w:val="42"/>
             <w:numPr>
+              <w:ilvl w:val="1"/>
               <w:numId w:val="0"/>
             </w:numPr>
             <w:shd w:val="clear" w:fill="F5F5F5"/>
@@ -17790,6 +18187,7 @@
           <w:pPr>
             <w:pStyle w:val="42"/>
             <w:numPr>
+              <w:ilvl w:val="1"/>
               <w:numId w:val="0"/>
             </w:numPr>
             <w:shd w:val="clear" w:fill="F5F5F5"/>
@@ -17827,6 +18225,7 @@
           <w:pPr>
             <w:pStyle w:val="42"/>
             <w:numPr>
+              <w:ilvl w:val="1"/>
               <w:numId w:val="0"/>
             </w:numPr>
             <w:shd w:val="clear" w:fill="F5F5F5"/>
@@ -17864,6 +18263,7 @@
           <w:pPr>
             <w:pStyle w:val="42"/>
             <w:numPr>
+              <w:ilvl w:val="1"/>
               <w:numId w:val="0"/>
             </w:numPr>
             <w:shd w:val="clear" w:fill="F5F5F5"/>
@@ -17901,6 +18301,7 @@
           <w:pPr>
             <w:pStyle w:val="42"/>
             <w:numPr>
+              <w:ilvl w:val="1"/>
               <w:numId w:val="0"/>
             </w:numPr>
             <w:shd w:val="clear" w:fill="F5F5F5"/>
@@ -17938,6 +18339,7 @@
           <w:pPr>
             <w:pStyle w:val="42"/>
             <w:numPr>
+              <w:ilvl w:val="1"/>
               <w:numId w:val="0"/>
             </w:numPr>
             <w:shd w:val="clear" w:fill="F5F5F5"/>
@@ -18040,6 +18442,7 @@
           <w:pPr>
             <w:pStyle w:val="42"/>
             <w:numPr>
+              <w:ilvl w:val="1"/>
               <w:numId w:val="0"/>
             </w:numPr>
             <w:shd w:val="clear" w:fill="F5F5F5"/>
@@ -18077,6 +18480,7 @@
           <w:pPr>
             <w:pStyle w:val="42"/>
             <w:numPr>
+              <w:ilvl w:val="1"/>
               <w:numId w:val="0"/>
             </w:numPr>
             <w:shd w:val="clear" w:fill="F5F5F5"/>
@@ -18140,6 +18544,7 @@
           <w:pPr>
             <w:pStyle w:val="42"/>
             <w:numPr>
+              <w:ilvl w:val="1"/>
               <w:numId w:val="0"/>
             </w:numPr>
             <w:shd w:val="clear" w:fill="F5F5F5"/>
@@ -18346,6 +18751,7 @@
           <w:pPr>
             <w:pStyle w:val="42"/>
             <w:numPr>
+              <w:ilvl w:val="1"/>
               <w:numId w:val="0"/>
             </w:numPr>
             <w:shd w:val="clear" w:fill="F5F5F5"/>
@@ -18526,6 +18932,7 @@
           <w:pPr>
             <w:pStyle w:val="42"/>
             <w:numPr>
+              <w:ilvl w:val="1"/>
               <w:numId w:val="0"/>
             </w:numPr>
             <w:shd w:val="clear" w:fill="F5F5F5"/>
@@ -18771,6 +19178,7 @@
           <w:pPr>
             <w:pStyle w:val="42"/>
             <w:numPr>
+              <w:ilvl w:val="1"/>
               <w:numId w:val="0"/>
             </w:numPr>
             <w:shd w:val="clear" w:fill="F5F5F5"/>
@@ -19003,6 +19411,7 @@
           <w:pPr>
             <w:pStyle w:val="42"/>
             <w:numPr>
+              <w:ilvl w:val="1"/>
               <w:numId w:val="0"/>
             </w:numPr>
             <w:shd w:val="clear" w:fill="F5F5F5"/>
@@ -19235,6 +19644,7 @@
           <w:pPr>
             <w:pStyle w:val="42"/>
             <w:numPr>
+              <w:ilvl w:val="1"/>
               <w:numId w:val="0"/>
             </w:numPr>
             <w:shd w:val="clear" w:fill="F5F5F5"/>
@@ -19467,6 +19877,7 @@
           <w:pPr>
             <w:pStyle w:val="42"/>
             <w:numPr>
+              <w:ilvl w:val="1"/>
               <w:numId w:val="0"/>
             </w:numPr>
             <w:shd w:val="clear" w:fill="F5F5F5"/>
@@ -19699,6 +20110,7 @@
           <w:pPr>
             <w:pStyle w:val="42"/>
             <w:numPr>
+              <w:ilvl w:val="1"/>
               <w:numId w:val="0"/>
             </w:numPr>
             <w:shd w:val="clear" w:fill="F5F5F5"/>
@@ -19944,6 +20356,7 @@
           <w:pPr>
             <w:pStyle w:val="42"/>
             <w:numPr>
+              <w:ilvl w:val="1"/>
               <w:numId w:val="0"/>
             </w:numPr>
             <w:shd w:val="clear" w:fill="F5F5F5"/>
@@ -20007,6 +20420,7 @@
           <w:pPr>
             <w:pStyle w:val="42"/>
             <w:numPr>
+              <w:ilvl w:val="1"/>
               <w:numId w:val="0"/>
             </w:numPr>
             <w:shd w:val="clear" w:fill="F5F5F5"/>
@@ -20044,6 +20458,7 @@
           <w:pPr>
             <w:pStyle w:val="42"/>
             <w:numPr>
+              <w:ilvl w:val="1"/>
               <w:numId w:val="0"/>
             </w:numPr>
             <w:shd w:val="clear" w:fill="F5F5F5"/>
@@ -20068,6 +20483,7 @@
           <w:pPr>
             <w:pStyle w:val="42"/>
             <w:numPr>
+              <w:ilvl w:val="1"/>
               <w:numId w:val="0"/>
             </w:numPr>
             <w:shd w:val="clear" w:fill="F5F5F5"/>
@@ -20105,6 +20521,7 @@
           <w:pPr>
             <w:pStyle w:val="42"/>
             <w:numPr>
+              <w:ilvl w:val="1"/>
               <w:numId w:val="0"/>
             </w:numPr>
             <w:shd w:val="clear" w:fill="F5F5F5"/>
@@ -20142,6 +20559,7 @@
           <w:pPr>
             <w:pStyle w:val="42"/>
             <w:numPr>
+              <w:ilvl w:val="1"/>
               <w:numId w:val="0"/>
             </w:numPr>
             <w:shd w:val="clear" w:fill="F5F5F5"/>
@@ -20179,6 +20597,7 @@
           <w:pPr>
             <w:pStyle w:val="42"/>
             <w:numPr>
+              <w:ilvl w:val="1"/>
               <w:numId w:val="0"/>
             </w:numPr>
             <w:shd w:val="clear" w:fill="F5F5F5"/>
@@ -20216,6 +20635,7 @@
           <w:pPr>
             <w:pStyle w:val="42"/>
             <w:numPr>
+              <w:ilvl w:val="1"/>
               <w:numId w:val="0"/>
             </w:numPr>
             <w:shd w:val="clear" w:fill="F5F5F5"/>
@@ -20279,6 +20699,7 @@
           <w:pPr>
             <w:pStyle w:val="42"/>
             <w:numPr>
+              <w:ilvl w:val="1"/>
               <w:numId w:val="0"/>
             </w:numPr>
             <w:shd w:val="clear" w:fill="F5F5F5"/>
@@ -20316,6 +20737,7 @@
           <w:pPr>
             <w:pStyle w:val="42"/>
             <w:numPr>
+              <w:ilvl w:val="1"/>
               <w:numId w:val="0"/>
             </w:numPr>
             <w:shd w:val="clear" w:fill="F5F5F5"/>
@@ -20444,6 +20866,7 @@
           <w:pPr>
             <w:pStyle w:val="42"/>
             <w:numPr>
+              <w:ilvl w:val="1"/>
               <w:numId w:val="0"/>
             </w:numPr>
             <w:shd w:val="clear" w:fill="F5F5F5"/>
@@ -20481,6 +20904,7 @@
           <w:pPr>
             <w:pStyle w:val="42"/>
             <w:numPr>
+              <w:ilvl w:val="1"/>
               <w:numId w:val="0"/>
             </w:numPr>
             <w:shd w:val="clear" w:fill="F5F5F5"/>
@@ -20570,6 +20994,7 @@
           <w:pPr>
             <w:pStyle w:val="42"/>
             <w:numPr>
+              <w:ilvl w:val="1"/>
               <w:numId w:val="0"/>
             </w:numPr>
             <w:shd w:val="clear" w:fill="F5F5F5"/>
@@ -20620,6 +21045,7 @@
           <w:pPr>
             <w:pStyle w:val="42"/>
             <w:numPr>
+              <w:ilvl w:val="1"/>
               <w:numId w:val="0"/>
             </w:numPr>
             <w:shd w:val="clear" w:fill="F5F5F5"/>
@@ -20813,6 +21239,7 @@
           <w:pPr>
             <w:pStyle w:val="42"/>
             <w:numPr>
+              <w:ilvl w:val="1"/>
               <w:numId w:val="0"/>
             </w:numPr>
             <w:shd w:val="clear" w:fill="F5F5F5"/>
@@ -20967,6 +21394,7 @@
           <w:pPr>
             <w:pStyle w:val="42"/>
             <w:numPr>
+              <w:ilvl w:val="1"/>
               <w:numId w:val="0"/>
             </w:numPr>
             <w:shd w:val="clear" w:fill="F5F5F5"/>
@@ -20991,6 +21419,7 @@
           <w:pPr>
             <w:pStyle w:val="42"/>
             <w:numPr>
+              <w:ilvl w:val="1"/>
               <w:numId w:val="0"/>
             </w:numPr>
             <w:shd w:val="clear" w:fill="F5F5F5"/>
@@ -21119,6 +21548,7 @@
           <w:pPr>
             <w:pStyle w:val="42"/>
             <w:numPr>
+              <w:ilvl w:val="1"/>
               <w:numId w:val="0"/>
             </w:numPr>
             <w:shd w:val="clear" w:fill="F5F5F5"/>
@@ -21169,6 +21599,7 @@
           <w:pPr>
             <w:pStyle w:val="42"/>
             <w:numPr>
+              <w:ilvl w:val="1"/>
               <w:numId w:val="0"/>
             </w:numPr>
             <w:shd w:val="clear" w:fill="F5F5F5"/>
@@ -21336,6 +21767,7 @@
           <w:pPr>
             <w:pStyle w:val="42"/>
             <w:numPr>
+              <w:ilvl w:val="1"/>
               <w:numId w:val="0"/>
             </w:numPr>
             <w:shd w:val="clear" w:fill="F5F5F5"/>
@@ -21555,6 +21987,7 @@
           <w:pPr>
             <w:pStyle w:val="42"/>
             <w:numPr>
+              <w:ilvl w:val="1"/>
               <w:numId w:val="0"/>
             </w:numPr>
             <w:shd w:val="clear" w:fill="F5F5F5"/>
@@ -21657,6 +22090,7 @@
           <w:pPr>
             <w:pStyle w:val="42"/>
             <w:numPr>
+              <w:ilvl w:val="1"/>
               <w:numId w:val="0"/>
             </w:numPr>
             <w:shd w:val="clear" w:fill="F5F5F5"/>
@@ -21707,6 +22141,7 @@
           <w:pPr>
             <w:pStyle w:val="42"/>
             <w:numPr>
+              <w:ilvl w:val="1"/>
               <w:numId w:val="0"/>
             </w:numPr>
             <w:shd w:val="clear" w:fill="F5F5F5"/>
@@ -21809,6 +22244,7 @@
           <w:pPr>
             <w:pStyle w:val="42"/>
             <w:numPr>
+              <w:ilvl w:val="1"/>
               <w:numId w:val="0"/>
             </w:numPr>
             <w:shd w:val="clear" w:fill="F5F5F5"/>
@@ -21846,6 +22282,7 @@
           <w:pPr>
             <w:pStyle w:val="42"/>
             <w:numPr>
+              <w:ilvl w:val="1"/>
               <w:numId w:val="0"/>
             </w:numPr>
             <w:shd w:val="clear" w:fill="F5F5F5"/>
@@ -21870,6 +22307,7 @@
           <w:pPr>
             <w:pStyle w:val="42"/>
             <w:numPr>
+              <w:ilvl w:val="1"/>
               <w:numId w:val="0"/>
             </w:numPr>
             <w:shd w:val="clear" w:fill="F5F5F5"/>
@@ -21907,6 +22345,7 @@
           <w:pPr>
             <w:pStyle w:val="42"/>
             <w:numPr>
+              <w:ilvl w:val="1"/>
               <w:numId w:val="0"/>
             </w:numPr>
             <w:shd w:val="clear" w:fill="F5F5F5"/>
@@ -21944,6 +22383,7 @@
           <w:pPr>
             <w:pStyle w:val="42"/>
             <w:numPr>
+              <w:ilvl w:val="1"/>
               <w:numId w:val="0"/>
             </w:numPr>
             <w:shd w:val="clear" w:fill="F5F5F5"/>
@@ -21981,6 +22421,7 @@
           <w:pPr>
             <w:pStyle w:val="42"/>
             <w:numPr>
+              <w:ilvl w:val="1"/>
               <w:numId w:val="0"/>
             </w:numPr>
             <w:shd w:val="clear" w:fill="F5F5F5"/>
@@ -22018,6 +22459,7 @@
           <w:pPr>
             <w:pStyle w:val="42"/>
             <w:numPr>
+              <w:ilvl w:val="1"/>
               <w:numId w:val="0"/>
             </w:numPr>
             <w:shd w:val="clear" w:fill="F5F5F5"/>
@@ -22055,6 +22497,7 @@
           <w:pPr>
             <w:pStyle w:val="42"/>
             <w:numPr>
+              <w:ilvl w:val="1"/>
               <w:numId w:val="0"/>
             </w:numPr>
             <w:shd w:val="clear" w:fill="F5F5F5"/>
@@ -22183,6 +22626,7 @@
           <w:pPr>
             <w:pStyle w:val="42"/>
             <w:numPr>
+              <w:ilvl w:val="1"/>
               <w:numId w:val="0"/>
             </w:numPr>
             <w:shd w:val="clear" w:fill="F5F5F5"/>
@@ -22220,6 +22664,7 @@
           <w:pPr>
             <w:pStyle w:val="42"/>
             <w:numPr>
+              <w:ilvl w:val="1"/>
               <w:numId w:val="0"/>
             </w:numPr>
             <w:shd w:val="clear" w:fill="F5F5F5"/>
@@ -22309,6 +22754,7 @@
           <w:pPr>
             <w:pStyle w:val="42"/>
             <w:numPr>
+              <w:ilvl w:val="1"/>
               <w:numId w:val="0"/>
             </w:numPr>
             <w:shd w:val="clear" w:fill="F5F5F5"/>
@@ -22567,6 +23013,7 @@
           <w:pPr>
             <w:pStyle w:val="42"/>
             <w:numPr>
+              <w:ilvl w:val="1"/>
               <w:numId w:val="0"/>
             </w:numPr>
             <w:shd w:val="clear" w:fill="F5F5F5"/>
@@ -22721,6 +23168,7 @@
           <w:pPr>
             <w:pStyle w:val="42"/>
             <w:numPr>
+              <w:ilvl w:val="1"/>
               <w:numId w:val="0"/>
             </w:numPr>
             <w:shd w:val="clear" w:fill="F5F5F5"/>
@@ -22966,6 +23414,7 @@
           <w:pPr>
             <w:pStyle w:val="42"/>
             <w:numPr>
+              <w:ilvl w:val="1"/>
               <w:numId w:val="0"/>
             </w:numPr>
             <w:shd w:val="clear" w:fill="F5F5F5"/>
@@ -22990,6 +23439,7 @@
           <w:pPr>
             <w:pStyle w:val="42"/>
             <w:numPr>
+              <w:ilvl w:val="1"/>
               <w:numId w:val="0"/>
             </w:numPr>
             <w:shd w:val="clear" w:fill="F5F5F5"/>
@@ -23040,6 +23490,7 @@
           <w:pPr>
             <w:pStyle w:val="42"/>
             <w:numPr>
+              <w:ilvl w:val="1"/>
               <w:numId w:val="0"/>
             </w:numPr>
             <w:shd w:val="clear" w:fill="F5F5F5"/>
@@ -23090,6 +23541,7 @@
           <w:pPr>
             <w:pStyle w:val="42"/>
             <w:numPr>
+              <w:ilvl w:val="1"/>
               <w:numId w:val="0"/>
             </w:numPr>
             <w:shd w:val="clear" w:fill="F5F5F5"/>
@@ -23309,6 +23761,7 @@
           <w:pPr>
             <w:pStyle w:val="42"/>
             <w:numPr>
+              <w:ilvl w:val="1"/>
               <w:numId w:val="0"/>
             </w:numPr>
             <w:shd w:val="clear" w:fill="F5F5F5"/>
@@ -23333,6 +23786,7 @@
           <w:pPr>
             <w:pStyle w:val="42"/>
             <w:numPr>
+              <w:ilvl w:val="1"/>
               <w:numId w:val="0"/>
             </w:numPr>
             <w:shd w:val="clear" w:fill="F5F5F5"/>
@@ -23461,6 +23915,7 @@
           <w:pPr>
             <w:pStyle w:val="42"/>
             <w:numPr>
+              <w:ilvl w:val="1"/>
               <w:numId w:val="0"/>
             </w:numPr>
             <w:shd w:val="clear" w:fill="F5F5F5"/>
@@ -23680,6 +24135,7 @@
           <w:pPr>
             <w:pStyle w:val="42"/>
             <w:numPr>
+              <w:ilvl w:val="1"/>
               <w:numId w:val="0"/>
             </w:numPr>
             <w:shd w:val="clear" w:fill="F5F5F5"/>
@@ -23730,6 +24186,7 @@
           <w:pPr>
             <w:pStyle w:val="42"/>
             <w:numPr>
+              <w:ilvl w:val="1"/>
               <w:numId w:val="0"/>
             </w:numPr>
             <w:shd w:val="clear" w:fill="F5F5F5"/>
@@ -23739,7 +24196,7 @@
             <w:jc w:val="left"/>
             <w:outlineLvl w:val="9"/>
             <w:rPr>
-              <w:rFonts w:hint="eastAsia" w:ascii="Consolas" w:hAnsi="Times New Roman" w:eastAsia="宋体" w:cs="Times New Roman"/>
+              <w:rFonts w:hint="default" w:ascii="Consolas" w:hAnsi="Times New Roman" w:eastAsia="宋体" w:cs="Times New Roman"/>
               <w:b/>
               <w:color w:val="252525"/>
               <w:kern w:val="2"/>
@@ -23853,11 +24310,104 @@
             </w:rPr>
             <w:t>);</w:t>
           </w:r>
+          <w:r>
+            <w:rPr>
+              <w:rFonts w:hint="eastAsia" w:ascii="Consolas" w:hAnsi="Times New Roman" w:eastAsia="宋体" w:cs="Times New Roman"/>
+              <w:b/>
+              <w:color w:val="252525"/>
+              <w:kern w:val="2"/>
+              <w:sz w:val="21"/>
+              <w:szCs w:val="28"/>
+              <w:shd w:val="clear"/>
+              <w:lang w:val="en-US" w:eastAsia="zh-CN" w:bidi="ar-SA"/>
+            </w:rPr>
+            <w:br w:type="textWrapping"/>
+          </w:r>
+          <w:r>
+            <w:rPr>
+              <w:rFonts w:hint="eastAsia" w:ascii="Consolas" w:eastAsia="宋体" w:cs="Times New Roman"/>
+              <w:b/>
+              <w:color w:val="252525"/>
+              <w:kern w:val="2"/>
+              <w:sz w:val="21"/>
+              <w:szCs w:val="28"/>
+              <w:shd w:val="clear"/>
+              <w:lang w:val="en-US" w:eastAsia="zh-CN" w:bidi="ar-SA"/>
+            </w:rPr>
+            <w:tab/>
+            <w:t/>
+          </w:r>
+          <w:r>
+            <w:rPr>
+              <w:rFonts w:hint="eastAsia" w:ascii="Consolas" w:eastAsia="宋体" w:cs="Times New Roman"/>
+              <w:b/>
+              <w:color w:val="252525"/>
+              <w:kern w:val="2"/>
+              <w:sz w:val="21"/>
+              <w:szCs w:val="28"/>
+              <w:shd w:val="clear"/>
+              <w:lang w:val="en-US" w:eastAsia="zh-CN" w:bidi="ar-SA"/>
+            </w:rPr>
+            <w:tab/>
+          </w:r>
+          <w:r>
+            <w:rPr>
+              <w:rFonts w:hint="eastAsia" w:ascii="Consolas" w:eastAsia="宋体" w:cs="Times New Roman"/>
+              <w:b/>
+              <w:color w:val="BB2726"/>
+              <w:kern w:val="2"/>
+              <w:sz w:val="21"/>
+              <w:szCs w:val="28"/>
+              <w:shd w:val="clear"/>
+              <w:lang w:val="en-US" w:eastAsia="zh-CN" w:bidi="ar-SA"/>
+            </w:rPr>
+            <w:t>vtaskDelay</w:t>
+          </w:r>
+          <w:r>
+            <w:rPr>
+              <w:rFonts w:hint="eastAsia" w:ascii="Consolas" w:eastAsia="宋体" w:cs="Times New Roman"/>
+              <w:b/>
+              <w:color w:val="252525"/>
+              <w:kern w:val="2"/>
+              <w:sz w:val="21"/>
+              <w:szCs w:val="28"/>
+              <w:shd w:val="clear"/>
+              <w:lang w:val="en-US" w:eastAsia="zh-CN" w:bidi="ar-SA"/>
+            </w:rPr>
+            <w:t>(</w:t>
+          </w:r>
+          <w:r>
+            <w:rPr>
+              <w:rFonts w:hint="eastAsia" w:ascii="Consolas" w:eastAsia="宋体" w:cs="Times New Roman"/>
+              <w:b/>
+              <w:color w:val="C48200"/>
+              <w:kern w:val="2"/>
+              <w:sz w:val="21"/>
+              <w:szCs w:val="28"/>
+              <w:shd w:val="clear"/>
+              <w:lang w:val="en-US" w:eastAsia="zh-CN" w:bidi="ar-SA"/>
+            </w:rPr>
+            <w:t>10</w:t>
+          </w:r>
+          <w:r>
+            <w:rPr>
+              <w:rFonts w:hint="eastAsia" w:ascii="Consolas" w:eastAsia="宋体" w:cs="Times New Roman"/>
+              <w:b/>
+              <w:color w:val="252525"/>
+              <w:kern w:val="2"/>
+              <w:sz w:val="21"/>
+              <w:szCs w:val="28"/>
+              <w:shd w:val="clear"/>
+              <w:lang w:val="en-US" w:eastAsia="zh-CN" w:bidi="ar-SA"/>
+            </w:rPr>
+            <w:t>);</w:t>
+          </w:r>
         </w:p>
         <w:p>
           <w:pPr>
             <w:pStyle w:val="42"/>
             <w:numPr>
+              <w:ilvl w:val="1"/>
               <w:numId w:val="0"/>
             </w:numPr>
             <w:shd w:val="clear" w:fill="F5F5F5"/>
@@ -23908,6 +24458,7 @@
           <w:pPr>
             <w:pStyle w:val="42"/>
             <w:numPr>
+              <w:ilvl w:val="1"/>
               <w:numId w:val="0"/>
             </w:numPr>
             <w:shd w:val="clear" w:fill="F5F5F5"/>
@@ -23932,6 +24483,7 @@
           <w:pPr>
             <w:pStyle w:val="42"/>
             <w:numPr>
+              <w:ilvl w:val="1"/>
               <w:numId w:val="0"/>
             </w:numPr>
             <w:shd w:val="clear" w:fill="F5F5F5"/>
@@ -24086,6 +24638,7 @@
           <w:pPr>
             <w:pStyle w:val="42"/>
             <w:numPr>
+              <w:ilvl w:val="1"/>
               <w:numId w:val="0"/>
             </w:numPr>
             <w:shd w:val="clear" w:fill="F5F5F5"/>
@@ -24344,6 +24897,7 @@
           <w:pPr>
             <w:pStyle w:val="42"/>
             <w:numPr>
+              <w:ilvl w:val="1"/>
               <w:numId w:val="0"/>
             </w:numPr>
             <w:shd w:val="clear" w:fill="F5F5F5"/>
@@ -24394,6 +24948,7 @@
           <w:pPr>
             <w:pStyle w:val="42"/>
             <w:numPr>
+              <w:ilvl w:val="1"/>
               <w:numId w:val="0"/>
             </w:numPr>
             <w:shd w:val="clear" w:fill="F5F5F5"/>
@@ -24535,6 +25090,7 @@
           <w:pPr>
             <w:pStyle w:val="42"/>
             <w:numPr>
+              <w:ilvl w:val="1"/>
               <w:numId w:val="0"/>
             </w:numPr>
             <w:shd w:val="clear" w:fill="F5F5F5"/>
@@ -24637,6 +25193,7 @@
           <w:pPr>
             <w:pStyle w:val="42"/>
             <w:numPr>
+              <w:ilvl w:val="1"/>
               <w:numId w:val="0"/>
             </w:numPr>
             <w:shd w:val="clear" w:fill="F5F5F5"/>
@@ -24687,6 +25244,7 @@
           <w:pPr>
             <w:pStyle w:val="42"/>
             <w:numPr>
+              <w:ilvl w:val="1"/>
               <w:numId w:val="0"/>
             </w:numPr>
             <w:shd w:val="clear" w:fill="F5F5F5"/>
@@ -24815,6 +25373,7 @@
           <w:pPr>
             <w:pStyle w:val="42"/>
             <w:numPr>
+              <w:ilvl w:val="1"/>
               <w:numId w:val="0"/>
             </w:numPr>
             <w:shd w:val="clear" w:fill="F5F5F5"/>
@@ -24865,6 +25424,7 @@
           <w:pPr>
             <w:pStyle w:val="42"/>
             <w:numPr>
+              <w:ilvl w:val="1"/>
               <w:numId w:val="0"/>
             </w:numPr>
             <w:shd w:val="clear" w:fill="F5F5F5"/>
@@ -24967,6 +25527,7 @@
           <w:pPr>
             <w:pStyle w:val="42"/>
             <w:numPr>
+              <w:ilvl w:val="1"/>
               <w:numId w:val="0"/>
             </w:numPr>
             <w:shd w:val="clear" w:fill="F5F5F5"/>
@@ -25017,6 +25578,7 @@
           <w:pPr>
             <w:pStyle w:val="42"/>
             <w:numPr>
+              <w:ilvl w:val="1"/>
               <w:numId w:val="0"/>
             </w:numPr>
             <w:shd w:val="clear" w:fill="F5F5F5"/>
@@ -25119,6 +25681,7 @@
           <w:pPr>
             <w:pStyle w:val="42"/>
             <w:numPr>
+              <w:ilvl w:val="1"/>
               <w:numId w:val="0"/>
             </w:numPr>
             <w:shd w:val="clear" w:fill="F5F5F5"/>
@@ -25156,6 +25719,7 @@
           <w:pPr>
             <w:pStyle w:val="42"/>
             <w:numPr>
+              <w:ilvl w:val="1"/>
               <w:numId w:val="0"/>
             </w:numPr>
             <w:shd w:val="clear" w:fill="F5F5F5"/>
@@ -25180,6 +25744,7 @@
           <w:pPr>
             <w:pStyle w:val="42"/>
             <w:numPr>
+              <w:ilvl w:val="1"/>
               <w:numId w:val="0"/>
             </w:numPr>
             <w:shd w:val="clear" w:fill="F5F5F5"/>
@@ -25308,6 +25873,7 @@
           <w:pPr>
             <w:pStyle w:val="42"/>
             <w:numPr>
+              <w:ilvl w:val="1"/>
               <w:numId w:val="0"/>
             </w:numPr>
             <w:shd w:val="clear" w:fill="F5F5F5"/>
@@ -25332,6 +25898,7 @@
           <w:pPr>
             <w:pStyle w:val="42"/>
             <w:numPr>
+              <w:ilvl w:val="1"/>
               <w:numId w:val="0"/>
             </w:numPr>
             <w:shd w:val="clear" w:fill="F5F5F5"/>
@@ -25369,6 +25936,7 @@
           <w:pPr>
             <w:pStyle w:val="42"/>
             <w:numPr>
+              <w:ilvl w:val="1"/>
               <w:numId w:val="0"/>
             </w:numPr>
             <w:shd w:val="clear" w:fill="F5F5F5"/>
@@ -25406,6 +25974,7 @@
           <w:pPr>
             <w:pStyle w:val="42"/>
             <w:numPr>
+              <w:ilvl w:val="1"/>
               <w:numId w:val="0"/>
             </w:numPr>
             <w:shd w:val="clear" w:fill="F5F5F5"/>
@@ -25443,6 +26012,7 @@
           <w:pPr>
             <w:pStyle w:val="42"/>
             <w:numPr>
+              <w:ilvl w:val="1"/>
               <w:numId w:val="0"/>
             </w:numPr>
             <w:shd w:val="clear" w:fill="F5F5F5"/>
@@ -25480,6 +26050,7 @@
           <w:pPr>
             <w:pStyle w:val="42"/>
             <w:numPr>
+              <w:ilvl w:val="1"/>
               <w:numId w:val="0"/>
             </w:numPr>
             <w:shd w:val="clear" w:fill="F5F5F5"/>
@@ -25517,6 +26088,7 @@
           <w:pPr>
             <w:pStyle w:val="42"/>
             <w:numPr>
+              <w:ilvl w:val="1"/>
               <w:numId w:val="0"/>
             </w:numPr>
             <w:shd w:val="clear" w:fill="F5F5F5"/>
@@ -25619,6 +26191,7 @@
           <w:pPr>
             <w:pStyle w:val="42"/>
             <w:numPr>
+              <w:ilvl w:val="1"/>
               <w:numId w:val="0"/>
             </w:numPr>
             <w:shd w:val="clear" w:fill="F5F5F5"/>
@@ -25656,6 +26229,7 @@
           <w:pPr>
             <w:pStyle w:val="42"/>
             <w:numPr>
+              <w:ilvl w:val="1"/>
               <w:numId w:val="0"/>
             </w:numPr>
             <w:shd w:val="clear" w:fill="F5F5F5"/>
@@ -25680,6 +26254,7 @@
           <w:pPr>
             <w:pStyle w:val="42"/>
             <w:numPr>
+              <w:ilvl w:val="1"/>
               <w:numId w:val="0"/>
             </w:numPr>
             <w:shd w:val="clear" w:fill="F5F5F5"/>
@@ -25730,6 +26305,7 @@
           <w:pPr>
             <w:pStyle w:val="42"/>
             <w:numPr>
+              <w:ilvl w:val="1"/>
               <w:numId w:val="0"/>
             </w:numPr>
             <w:shd w:val="clear" w:fill="F5F5F5"/>
@@ -25780,6 +26356,7 @@
           <w:pPr>
             <w:pStyle w:val="42"/>
             <w:numPr>
+              <w:ilvl w:val="1"/>
               <w:numId w:val="0"/>
             </w:numPr>
             <w:shd w:val="clear" w:fill="F5F5F5"/>
@@ -25947,6 +26524,7 @@
           <w:pPr>
             <w:pStyle w:val="42"/>
             <w:numPr>
+              <w:ilvl w:val="1"/>
               <w:numId w:val="0"/>
             </w:numPr>
             <w:shd w:val="clear" w:fill="F5F5F5"/>
@@ -25971,6 +26549,7 @@
           <w:pPr>
             <w:pStyle w:val="42"/>
             <w:numPr>
+              <w:ilvl w:val="1"/>
               <w:numId w:val="0"/>
             </w:numPr>
             <w:shd w:val="clear" w:fill="F5F5F5"/>
@@ -26021,6 +26600,7 @@
           <w:pPr>
             <w:pStyle w:val="42"/>
             <w:numPr>
+              <w:ilvl w:val="1"/>
               <w:numId w:val="0"/>
             </w:numPr>
             <w:shd w:val="clear" w:fill="F5F5F5"/>
@@ -26188,6 +26768,7 @@
           <w:pPr>
             <w:pStyle w:val="42"/>
             <w:numPr>
+              <w:ilvl w:val="1"/>
               <w:numId w:val="0"/>
             </w:numPr>
             <w:shd w:val="clear" w:fill="F5F5F5"/>
@@ -26212,6 +26793,7 @@
           <w:pPr>
             <w:pStyle w:val="42"/>
             <w:numPr>
+              <w:ilvl w:val="1"/>
               <w:numId w:val="0"/>
             </w:numPr>
             <w:shd w:val="clear" w:fill="F5F5F5"/>
@@ -26262,6 +26844,7 @@
           <w:pPr>
             <w:pStyle w:val="42"/>
             <w:numPr>
+              <w:ilvl w:val="1"/>
               <w:numId w:val="0"/>
             </w:numPr>
             <w:shd w:val="clear" w:fill="F5F5F5"/>
@@ -26429,6 +27012,7 @@
           <w:pPr>
             <w:pStyle w:val="42"/>
             <w:numPr>
+              <w:ilvl w:val="1"/>
               <w:numId w:val="0"/>
             </w:numPr>
             <w:shd w:val="clear" w:fill="F5F5F5"/>
@@ -26453,6 +27037,7 @@
           <w:pPr>
             <w:pStyle w:val="42"/>
             <w:numPr>
+              <w:ilvl w:val="1"/>
               <w:numId w:val="0"/>
             </w:numPr>
             <w:shd w:val="clear" w:fill="F5F5F5"/>
@@ -26672,6 +27257,7 @@
           <w:pPr>
             <w:pStyle w:val="42"/>
             <w:numPr>
+              <w:ilvl w:val="1"/>
               <w:numId w:val="0"/>
             </w:numPr>
             <w:shd w:val="clear" w:fill="F5F5F5"/>
@@ -26722,6 +27308,7 @@
           <w:pPr>
             <w:pStyle w:val="42"/>
             <w:numPr>
+              <w:ilvl w:val="1"/>
               <w:numId w:val="0"/>
             </w:numPr>
             <w:shd w:val="clear" w:fill="F5F5F5"/>
@@ -26902,6 +27489,7 @@
           <w:pPr>
             <w:pStyle w:val="42"/>
             <w:numPr>
+              <w:ilvl w:val="1"/>
               <w:numId w:val="0"/>
             </w:numPr>
             <w:shd w:val="clear" w:fill="F5F5F5"/>
@@ -26965,6 +27553,7 @@
           <w:pPr>
             <w:pStyle w:val="42"/>
             <w:numPr>
+              <w:ilvl w:val="1"/>
               <w:numId w:val="0"/>
             </w:numPr>
             <w:shd w:val="clear" w:fill="F5F5F5"/>
@@ -27080,6 +27669,7 @@
           <w:pPr>
             <w:pStyle w:val="42"/>
             <w:numPr>
+              <w:ilvl w:val="1"/>
               <w:numId w:val="0"/>
             </w:numPr>
             <w:shd w:val="clear" w:fill="F5F5F5"/>
@@ -27143,6 +27733,7 @@
           <w:pPr>
             <w:pStyle w:val="42"/>
             <w:numPr>
+              <w:ilvl w:val="1"/>
               <w:numId w:val="0"/>
             </w:numPr>
             <w:shd w:val="clear" w:fill="F5F5F5"/>
@@ -27193,6 +27784,7 @@
           <w:pPr>
             <w:pStyle w:val="42"/>
             <w:numPr>
+              <w:ilvl w:val="1"/>
               <w:numId w:val="0"/>
             </w:numPr>
             <w:shd w:val="clear" w:fill="F5F5F5"/>
@@ -27282,6 +27874,7 @@
           <w:pPr>
             <w:pStyle w:val="42"/>
             <w:numPr>
+              <w:ilvl w:val="1"/>
               <w:numId w:val="0"/>
             </w:numPr>
             <w:shd w:val="clear" w:fill="F5F5F5"/>
@@ -27319,6 +27912,7 @@
           <w:pPr>
             <w:pStyle w:val="42"/>
             <w:numPr>
+              <w:ilvl w:val="1"/>
               <w:numId w:val="0"/>
             </w:numPr>
             <w:shd w:val="clear" w:fill="F5F5F5"/>
@@ -27343,6 +27937,7 @@
           <w:pPr>
             <w:pStyle w:val="42"/>
             <w:numPr>
+              <w:ilvl w:val="1"/>
               <w:numId w:val="0"/>
             </w:numPr>
             <w:shd w:val="clear" w:fill="F5F5F5"/>
@@ -27380,6 +27975,7 @@
           <w:pPr>
             <w:pStyle w:val="42"/>
             <w:numPr>
+              <w:ilvl w:val="1"/>
               <w:numId w:val="0"/>
             </w:numPr>
             <w:shd w:val="clear" w:fill="F5F5F5"/>
@@ -27417,6 +28013,7 @@
           <w:pPr>
             <w:pStyle w:val="42"/>
             <w:numPr>
+              <w:ilvl w:val="1"/>
               <w:numId w:val="0"/>
             </w:numPr>
             <w:shd w:val="clear" w:fill="F5F5F5"/>
@@ -27454,6 +28051,7 @@
           <w:pPr>
             <w:pStyle w:val="42"/>
             <w:numPr>
+              <w:ilvl w:val="1"/>
               <w:numId w:val="0"/>
             </w:numPr>
             <w:shd w:val="clear" w:fill="F5F5F5"/>
@@ -27491,6 +28089,7 @@
           <w:pPr>
             <w:pStyle w:val="42"/>
             <w:numPr>
+              <w:ilvl w:val="1"/>
               <w:numId w:val="0"/>
             </w:numPr>
             <w:shd w:val="clear" w:fill="F5F5F5"/>
@@ -27593,6 +28192,7 @@
           <w:pPr>
             <w:pStyle w:val="42"/>
             <w:numPr>
+              <w:ilvl w:val="1"/>
               <w:numId w:val="0"/>
             </w:numPr>
             <w:shd w:val="clear" w:fill="F5F5F5"/>
@@ -27630,6 +28230,7 @@
           <w:pPr>
             <w:pStyle w:val="42"/>
             <w:numPr>
+              <w:ilvl w:val="1"/>
               <w:numId w:val="0"/>
             </w:numPr>
             <w:shd w:val="clear" w:fill="F5F5F5"/>
@@ -27680,6 +28281,7 @@
           <w:pPr>
             <w:pStyle w:val="42"/>
             <w:numPr>
+              <w:ilvl w:val="1"/>
               <w:numId w:val="0"/>
             </w:numPr>
             <w:shd w:val="clear" w:fill="F5F5F5"/>
@@ -27769,6 +28371,7 @@
           <w:pPr>
             <w:pStyle w:val="42"/>
             <w:numPr>
+              <w:ilvl w:val="1"/>
               <w:numId w:val="0"/>
             </w:numPr>
             <w:shd w:val="clear" w:fill="F5F5F5"/>
@@ -27819,6 +28422,7 @@
           <w:pPr>
             <w:pStyle w:val="42"/>
             <w:numPr>
+              <w:ilvl w:val="1"/>
               <w:numId w:val="0"/>
             </w:numPr>
             <w:shd w:val="clear" w:fill="F5F5F5"/>
@@ -27934,6 +28538,7 @@
           <w:pPr>
             <w:pStyle w:val="42"/>
             <w:numPr>
+              <w:ilvl w:val="1"/>
               <w:numId w:val="0"/>
             </w:numPr>
             <w:shd w:val="clear" w:fill="F5F5F5"/>
@@ -27984,6 +28589,7 @@
           <w:pPr>
             <w:pStyle w:val="42"/>
             <w:numPr>
+              <w:ilvl w:val="1"/>
               <w:numId w:val="0"/>
             </w:numPr>
             <w:shd w:val="clear" w:fill="F5F5F5"/>
@@ -28047,6 +28653,7 @@
           <w:pPr>
             <w:pStyle w:val="42"/>
             <w:numPr>
+              <w:ilvl w:val="1"/>
               <w:numId w:val="0"/>
             </w:numPr>
             <w:shd w:val="clear" w:fill="F5F5F5"/>
@@ -28149,6 +28756,7 @@
           <w:pPr>
             <w:pStyle w:val="42"/>
             <w:numPr>
+              <w:ilvl w:val="1"/>
               <w:numId w:val="0"/>
             </w:numPr>
             <w:shd w:val="clear" w:fill="F5F5F5"/>
@@ -28199,6 +28807,7 @@
           <w:pPr>
             <w:pStyle w:val="42"/>
             <w:numPr>
+              <w:ilvl w:val="1"/>
               <w:numId w:val="0"/>
             </w:numPr>
             <w:shd w:val="clear" w:fill="F5F5F5"/>
@@ -28223,6 +28832,7 @@
           <w:pPr>
             <w:pStyle w:val="42"/>
             <w:numPr>
+              <w:ilvl w:val="1"/>
               <w:numId w:val="0"/>
             </w:numPr>
             <w:shd w:val="clear" w:fill="F5F5F5"/>
@@ -28273,6 +28883,7 @@
           <w:pPr>
             <w:pStyle w:val="42"/>
             <w:numPr>
+              <w:ilvl w:val="1"/>
               <w:numId w:val="0"/>
             </w:numPr>
             <w:shd w:val="clear" w:fill="F5F5F5"/>
@@ -28336,6 +28947,7 @@
           <w:pPr>
             <w:pStyle w:val="42"/>
             <w:numPr>
+              <w:ilvl w:val="1"/>
               <w:numId w:val="0"/>
             </w:numPr>
             <w:shd w:val="clear" w:fill="F5F5F5"/>
@@ -28425,6 +29037,7 @@
           <w:pPr>
             <w:pStyle w:val="42"/>
             <w:numPr>
+              <w:ilvl w:val="1"/>
               <w:numId w:val="0"/>
             </w:numPr>
             <w:shd w:val="clear" w:fill="F5F5F5"/>
@@ -28462,6 +29075,7 @@
           <w:pPr>
             <w:pStyle w:val="42"/>
             <w:numPr>
+              <w:ilvl w:val="1"/>
               <w:numId w:val="0"/>
             </w:numPr>
             <w:shd w:val="clear" w:fill="F5F5F5"/>
@@ -28484,6 +29098,7 @@
       <w:pPr>
         <w:pStyle w:val="42"/>
         <w:numPr>
+          <w:ilvl w:val="1"/>
           <w:numId w:val="0"/>
         </w:numPr>
         <w:bidi w:val="0"/>
@@ -28553,6 +29168,7 @@
           <w:pPr>
             <w:pStyle w:val="43"/>
             <w:numPr>
+              <w:ilvl w:val="2"/>
               <w:numId w:val="0"/>
             </w:numPr>
             <w:shd w:val="clear" w:fill="F5F5F5"/>
@@ -28615,6 +29231,7 @@
           <w:pPr>
             <w:pStyle w:val="43"/>
             <w:numPr>
+              <w:ilvl w:val="2"/>
               <w:numId w:val="0"/>
             </w:numPr>
             <w:shd w:val="clear" w:fill="F5F5F5"/>
@@ -28638,6 +29255,7 @@
           <w:pPr>
             <w:pStyle w:val="43"/>
             <w:numPr>
+              <w:ilvl w:val="2"/>
               <w:numId w:val="0"/>
             </w:numPr>
             <w:shd w:val="clear" w:fill="F5F5F5"/>
@@ -28661,6 +29279,7 @@
           <w:pPr>
             <w:pStyle w:val="43"/>
             <w:numPr>
+              <w:ilvl w:val="2"/>
               <w:numId w:val="0"/>
             </w:numPr>
             <w:shd w:val="clear" w:fill="F5F5F5"/>
@@ -28697,6 +29316,7 @@
           <w:pPr>
             <w:pStyle w:val="43"/>
             <w:numPr>
+              <w:ilvl w:val="2"/>
               <w:numId w:val="0"/>
             </w:numPr>
             <w:shd w:val="clear" w:fill="F5F5F5"/>
@@ -28928,6 +29548,7 @@
           <w:pPr>
             <w:pStyle w:val="43"/>
             <w:numPr>
+              <w:ilvl w:val="2"/>
               <w:numId w:val="0"/>
             </w:numPr>
             <w:shd w:val="clear" w:fill="F5F5F5"/>
@@ -29159,6 +29780,7 @@
           <w:pPr>
             <w:pStyle w:val="43"/>
             <w:numPr>
+              <w:ilvl w:val="2"/>
               <w:numId w:val="0"/>
             </w:numPr>
             <w:shd w:val="clear" w:fill="F5F5F5"/>
@@ -29390,6 +30012,7 @@
           <w:pPr>
             <w:pStyle w:val="43"/>
             <w:numPr>
+              <w:ilvl w:val="2"/>
               <w:numId w:val="0"/>
             </w:numPr>
             <w:shd w:val="clear" w:fill="F5F5F5"/>
@@ -29621,6 +30244,7 @@
           <w:pPr>
             <w:pStyle w:val="43"/>
             <w:numPr>
+              <w:ilvl w:val="2"/>
               <w:numId w:val="0"/>
             </w:numPr>
             <w:shd w:val="clear" w:fill="F5F5F5"/>
@@ -29644,6 +30268,7 @@
           <w:pPr>
             <w:pStyle w:val="43"/>
             <w:numPr>
+              <w:ilvl w:val="2"/>
               <w:numId w:val="0"/>
             </w:numPr>
             <w:shd w:val="clear" w:fill="F5F5F5"/>
@@ -29680,6 +30305,7 @@
           <w:pPr>
             <w:pStyle w:val="43"/>
             <w:numPr>
+              <w:ilvl w:val="2"/>
               <w:numId w:val="0"/>
             </w:numPr>
             <w:shd w:val="clear" w:fill="F5F5F5"/>
@@ -29859,6 +30485,7 @@
           <w:pPr>
             <w:pStyle w:val="43"/>
             <w:numPr>
+              <w:ilvl w:val="2"/>
               <w:numId w:val="0"/>
             </w:numPr>
             <w:shd w:val="clear" w:fill="F5F5F5"/>
@@ -30038,6 +30665,7 @@
           <w:pPr>
             <w:pStyle w:val="43"/>
             <w:numPr>
+              <w:ilvl w:val="2"/>
               <w:numId w:val="0"/>
             </w:numPr>
             <w:shd w:val="clear" w:fill="F5F5F5"/>
@@ -30217,6 +30845,7 @@
           <w:pPr>
             <w:pStyle w:val="43"/>
             <w:numPr>
+              <w:ilvl w:val="2"/>
               <w:numId w:val="0"/>
             </w:numPr>
             <w:shd w:val="clear" w:fill="F5F5F5"/>
@@ -30396,6 +31025,7 @@
           <w:pPr>
             <w:pStyle w:val="43"/>
             <w:numPr>
+              <w:ilvl w:val="2"/>
               <w:numId w:val="0"/>
             </w:numPr>
             <w:shd w:val="clear" w:fill="F5F5F5"/>
@@ -30419,6 +31049,7 @@
           <w:pPr>
             <w:pStyle w:val="43"/>
             <w:numPr>
+              <w:ilvl w:val="2"/>
               <w:numId w:val="0"/>
             </w:numPr>
             <w:shd w:val="clear" w:fill="F5F5F5"/>
@@ -30455,6 +31086,7 @@
           <w:pPr>
             <w:pStyle w:val="43"/>
             <w:numPr>
+              <w:ilvl w:val="2"/>
               <w:numId w:val="0"/>
             </w:numPr>
             <w:shd w:val="clear" w:fill="F5F5F5"/>
@@ -30556,6 +31188,7 @@
           <w:pPr>
             <w:pStyle w:val="43"/>
             <w:numPr>
+              <w:ilvl w:val="2"/>
               <w:numId w:val="0"/>
             </w:numPr>
             <w:shd w:val="clear" w:fill="F5F5F5"/>
@@ -30579,6 +31212,7 @@
           <w:pPr>
             <w:pStyle w:val="43"/>
             <w:numPr>
+              <w:ilvl w:val="2"/>
               <w:numId w:val="0"/>
             </w:numPr>
             <w:shd w:val="clear" w:fill="F5F5F5"/>
@@ -30615,6 +31249,7 @@
           <w:pPr>
             <w:pStyle w:val="43"/>
             <w:numPr>
+              <w:ilvl w:val="2"/>
               <w:numId w:val="0"/>
             </w:numPr>
             <w:shd w:val="clear" w:fill="F5F5F5"/>
@@ -30716,6 +31351,7 @@
           <w:pPr>
             <w:pStyle w:val="43"/>
             <w:numPr>
+              <w:ilvl w:val="2"/>
               <w:numId w:val="0"/>
             </w:numPr>
             <w:shd w:val="clear" w:fill="F5F5F5"/>
@@ -30739,6 +31375,7 @@
           <w:pPr>
             <w:pStyle w:val="43"/>
             <w:numPr>
+              <w:ilvl w:val="2"/>
               <w:numId w:val="0"/>
             </w:numPr>
             <w:shd w:val="clear" w:fill="F5F5F5"/>
@@ -30775,6 +31412,7 @@
           <w:pPr>
             <w:pStyle w:val="43"/>
             <w:numPr>
+              <w:ilvl w:val="2"/>
               <w:numId w:val="0"/>
             </w:numPr>
             <w:shd w:val="clear" w:fill="F5F5F5"/>
@@ -30902,6 +31540,7 @@
           <w:pPr>
             <w:pStyle w:val="43"/>
             <w:numPr>
+              <w:ilvl w:val="2"/>
               <w:numId w:val="0"/>
             </w:numPr>
             <w:shd w:val="clear" w:fill="F5F5F5"/>
@@ -30990,6 +31629,7 @@
           <w:pPr>
             <w:pStyle w:val="43"/>
             <w:numPr>
+              <w:ilvl w:val="2"/>
               <w:numId w:val="0"/>
             </w:numPr>
             <w:shd w:val="clear" w:fill="F5F5F5"/>
@@ -31078,6 +31718,7 @@
           <w:pPr>
             <w:pStyle w:val="43"/>
             <w:numPr>
+              <w:ilvl w:val="2"/>
               <w:numId w:val="0"/>
             </w:numPr>
             <w:shd w:val="clear" w:fill="F5F5F5"/>
@@ -31153,6 +31794,7 @@
           <w:pPr>
             <w:pStyle w:val="43"/>
             <w:numPr>
+              <w:ilvl w:val="2"/>
               <w:numId w:val="0"/>
             </w:numPr>
             <w:shd w:val="clear" w:fill="F5F5F5"/>
@@ -31189,6 +31831,7 @@
           <w:pPr>
             <w:pStyle w:val="43"/>
             <w:numPr>
+              <w:ilvl w:val="2"/>
               <w:numId w:val="0"/>
             </w:numPr>
             <w:shd w:val="clear" w:fill="F5F5F5"/>
@@ -31277,6 +31920,7 @@
           <w:pPr>
             <w:pStyle w:val="43"/>
             <w:numPr>
+              <w:ilvl w:val="2"/>
               <w:numId w:val="0"/>
             </w:numPr>
             <w:shd w:val="clear" w:fill="F5F5F5"/>
@@ -31300,6 +31944,7 @@
           <w:pPr>
             <w:pStyle w:val="43"/>
             <w:numPr>
+              <w:ilvl w:val="2"/>
               <w:numId w:val="0"/>
             </w:numPr>
             <w:shd w:val="clear" w:fill="F5F5F5"/>
@@ -31336,6 +31981,7 @@
           <w:pPr>
             <w:pStyle w:val="43"/>
             <w:numPr>
+              <w:ilvl w:val="2"/>
               <w:numId w:val="0"/>
             </w:numPr>
             <w:shd w:val="clear" w:fill="F5F5F5"/>
@@ -31372,6 +32018,7 @@
           <w:pPr>
             <w:pStyle w:val="43"/>
             <w:numPr>
+              <w:ilvl w:val="2"/>
               <w:numId w:val="0"/>
             </w:numPr>
             <w:shd w:val="clear" w:fill="F5F5F5"/>
@@ -31408,6 +32055,7 @@
           <w:pPr>
             <w:pStyle w:val="43"/>
             <w:numPr>
+              <w:ilvl w:val="2"/>
               <w:numId w:val="0"/>
             </w:numPr>
             <w:shd w:val="clear" w:fill="F5F5F5"/>
@@ -31509,6 +32157,7 @@
           <w:pPr>
             <w:pStyle w:val="43"/>
             <w:numPr>
+              <w:ilvl w:val="2"/>
               <w:numId w:val="0"/>
             </w:numPr>
             <w:shd w:val="clear" w:fill="F5F5F5"/>
@@ -31545,6 +32194,7 @@
           <w:pPr>
             <w:pStyle w:val="43"/>
             <w:numPr>
+              <w:ilvl w:val="2"/>
               <w:numId w:val="0"/>
             </w:numPr>
             <w:shd w:val="clear" w:fill="F5F5F5"/>
@@ -31568,6 +32218,7 @@
           <w:pPr>
             <w:pStyle w:val="43"/>
             <w:numPr>
+              <w:ilvl w:val="2"/>
               <w:numId w:val="0"/>
             </w:numPr>
             <w:shd w:val="clear" w:fill="F5F5F5"/>
@@ -31617,6 +32268,7 @@
           <w:pPr>
             <w:pStyle w:val="43"/>
             <w:numPr>
+              <w:ilvl w:val="2"/>
               <w:numId w:val="0"/>
             </w:numPr>
             <w:shd w:val="clear" w:fill="F5F5F5"/>
@@ -31835,6 +32487,7 @@
           <w:pPr>
             <w:pStyle w:val="43"/>
             <w:numPr>
+              <w:ilvl w:val="2"/>
               <w:numId w:val="0"/>
             </w:numPr>
             <w:shd w:val="clear" w:fill="F5F5F5"/>
@@ -31858,6 +32511,7 @@
           <w:pPr>
             <w:pStyle w:val="43"/>
             <w:numPr>
+              <w:ilvl w:val="2"/>
               <w:numId w:val="0"/>
             </w:numPr>
             <w:shd w:val="clear" w:fill="F5F5F5"/>
@@ -31907,6 +32561,7 @@
           <w:pPr>
             <w:pStyle w:val="43"/>
             <w:numPr>
+              <w:ilvl w:val="2"/>
               <w:numId w:val="0"/>
             </w:numPr>
             <w:shd w:val="clear" w:fill="F5F5F5"/>
@@ -31969,6 +32624,7 @@
           <w:pPr>
             <w:pStyle w:val="43"/>
             <w:numPr>
+              <w:ilvl w:val="2"/>
               <w:numId w:val="0"/>
             </w:numPr>
             <w:shd w:val="clear" w:fill="F5F5F5"/>
@@ -32005,6 +32661,7 @@
           <w:pPr>
             <w:pStyle w:val="43"/>
             <w:numPr>
+              <w:ilvl w:val="2"/>
               <w:numId w:val="0"/>
             </w:numPr>
             <w:shd w:val="clear" w:fill="F5F5F5"/>
@@ -32028,6 +32685,7 @@
           <w:pPr>
             <w:pStyle w:val="43"/>
             <w:numPr>
+              <w:ilvl w:val="2"/>
               <w:numId w:val="0"/>
             </w:numPr>
             <w:shd w:val="clear" w:fill="F5F5F5"/>
@@ -32155,6 +32813,7 @@
           <w:pPr>
             <w:pStyle w:val="43"/>
             <w:numPr>
+              <w:ilvl w:val="2"/>
               <w:numId w:val="0"/>
             </w:numPr>
             <w:shd w:val="clear" w:fill="F5F5F5"/>
@@ -32178,6 +32837,7 @@
           <w:pPr>
             <w:pStyle w:val="43"/>
             <w:numPr>
+              <w:ilvl w:val="2"/>
               <w:numId w:val="0"/>
             </w:numPr>
             <w:shd w:val="clear" w:fill="F5F5F5"/>
@@ -32305,6 +32965,7 @@
           <w:pPr>
             <w:pStyle w:val="43"/>
             <w:numPr>
+              <w:ilvl w:val="2"/>
               <w:numId w:val="0"/>
             </w:numPr>
             <w:shd w:val="clear" w:fill="F5F5F5"/>
@@ -32341,6 +33002,7 @@
           <w:pPr>
             <w:pStyle w:val="43"/>
             <w:numPr>
+              <w:ilvl w:val="2"/>
               <w:numId w:val="0"/>
             </w:numPr>
             <w:shd w:val="clear" w:fill="F5F5F5"/>
@@ -32390,6 +33052,7 @@
           <w:pPr>
             <w:pStyle w:val="43"/>
             <w:numPr>
+              <w:ilvl w:val="2"/>
               <w:numId w:val="0"/>
             </w:numPr>
             <w:shd w:val="clear" w:fill="F5F5F5"/>
@@ -32504,6 +33167,7 @@
           <w:pPr>
             <w:pStyle w:val="43"/>
             <w:numPr>
+              <w:ilvl w:val="2"/>
               <w:numId w:val="0"/>
             </w:numPr>
             <w:shd w:val="clear" w:fill="F5F5F5"/>
@@ -32592,6 +33256,7 @@
           <w:pPr>
             <w:pStyle w:val="43"/>
             <w:numPr>
+              <w:ilvl w:val="2"/>
               <w:numId w:val="0"/>
             </w:numPr>
             <w:shd w:val="clear" w:fill="F5F5F5"/>
@@ -32628,6 +33293,7 @@
           <w:pPr>
             <w:pStyle w:val="43"/>
             <w:numPr>
+              <w:ilvl w:val="2"/>
               <w:numId w:val="0"/>
             </w:numPr>
             <w:shd w:val="clear" w:fill="F5F5F5"/>
@@ -32677,6 +33343,7 @@
           <w:pPr>
             <w:pStyle w:val="43"/>
             <w:numPr>
+              <w:ilvl w:val="2"/>
               <w:numId w:val="0"/>
             </w:numPr>
             <w:shd w:val="clear" w:fill="F5F5F5"/>
@@ -32817,6 +33484,7 @@
           <w:pPr>
             <w:pStyle w:val="43"/>
             <w:numPr>
+              <w:ilvl w:val="2"/>
               <w:numId w:val="0"/>
             </w:numPr>
             <w:shd w:val="clear" w:fill="F5F5F5"/>
@@ -32931,6 +33599,7 @@
           <w:pPr>
             <w:pStyle w:val="43"/>
             <w:numPr>
+              <w:ilvl w:val="2"/>
               <w:numId w:val="0"/>
             </w:numPr>
             <w:shd w:val="clear" w:fill="F5F5F5"/>
@@ -32967,6 +33636,7 @@
           <w:pPr>
             <w:pStyle w:val="43"/>
             <w:numPr>
+              <w:ilvl w:val="2"/>
               <w:numId w:val="0"/>
             </w:numPr>
             <w:shd w:val="clear" w:fill="F5F5F5"/>
@@ -33081,6 +33751,7 @@
           <w:pPr>
             <w:pStyle w:val="43"/>
             <w:numPr>
+              <w:ilvl w:val="2"/>
               <w:numId w:val="0"/>
             </w:numPr>
             <w:shd w:val="clear" w:fill="F5F5F5"/>
@@ -33117,6 +33788,7 @@
           <w:pPr>
             <w:pStyle w:val="43"/>
             <w:numPr>
+              <w:ilvl w:val="2"/>
               <w:numId w:val="0"/>
             </w:numPr>
             <w:shd w:val="clear" w:fill="F5F5F5"/>
@@ -33153,6 +33825,7 @@
           <w:pPr>
             <w:pStyle w:val="43"/>
             <w:numPr>
+              <w:ilvl w:val="2"/>
               <w:numId w:val="0"/>
             </w:numPr>
             <w:shd w:val="clear" w:fill="F5F5F5"/>
@@ -33202,6 +33875,7 @@
           <w:pPr>
             <w:pStyle w:val="43"/>
             <w:numPr>
+              <w:ilvl w:val="2"/>
               <w:numId w:val="0"/>
             </w:numPr>
             <w:shd w:val="clear" w:fill="F5F5F5"/>
@@ -33316,6 +33990,7 @@
           <w:pPr>
             <w:pStyle w:val="43"/>
             <w:numPr>
+              <w:ilvl w:val="2"/>
               <w:numId w:val="0"/>
             </w:numPr>
             <w:shd w:val="clear" w:fill="F5F5F5"/>
@@ -33352,6 +34027,7 @@
           <w:pPr>
             <w:pStyle w:val="43"/>
             <w:numPr>
+              <w:ilvl w:val="2"/>
               <w:numId w:val="0"/>
             </w:numPr>
             <w:shd w:val="clear" w:fill="F5F5F5"/>
@@ -33388,6 +34064,7 @@
           <w:pPr>
             <w:pStyle w:val="43"/>
             <w:numPr>
+              <w:ilvl w:val="2"/>
               <w:numId w:val="0"/>
             </w:numPr>
             <w:shd w:val="clear" w:fill="F5F5F5"/>
@@ -33409,6 +34086,7 @@
       <w:pPr>
         <w:pStyle w:val="42"/>
         <w:numPr>
+          <w:ilvl w:val="1"/>
           <w:numId w:val="0"/>
         </w:numPr>
         <w:bidi w:val="0"/>
@@ -33449,6 +34127,7 @@
       <w:pPr>
         <w:pStyle w:val="43"/>
         <w:numPr>
+          <w:ilvl w:val="2"/>
           <w:numId w:val="0"/>
         </w:numPr>
         <w:ind w:left="425" w:leftChars="0" w:hanging="425" w:firstLineChars="0"/>
@@ -34215,6 +34894,7 @@
       <w:pPr>
         <w:pStyle w:val="43"/>
         <w:numPr>
+          <w:ilvl w:val="2"/>
           <w:numId w:val="0"/>
         </w:numPr>
         <w:ind w:left="425" w:leftChars="0" w:hanging="425" w:firstLineChars="0"/>
@@ -36232,6 +36912,7 @@
       <w:pPr>
         <w:pStyle w:val="43"/>
         <w:numPr>
+          <w:ilvl w:val="2"/>
           <w:numId w:val="0"/>
         </w:numPr>
         <w:bidi w:val="0"/>
@@ -36664,6 +37345,7 @@
           <w:pPr>
             <w:pStyle w:val="43"/>
             <w:numPr>
+              <w:ilvl w:val="2"/>
               <w:numId w:val="0"/>
             </w:numPr>
             <w:shd w:val="clear" w:fill="F5F5F5"/>
@@ -36726,6 +37408,7 @@
           <w:pPr>
             <w:pStyle w:val="43"/>
             <w:numPr>
+              <w:ilvl w:val="2"/>
               <w:numId w:val="0"/>
             </w:numPr>
             <w:shd w:val="clear" w:fill="F5F5F5"/>
@@ -36749,6 +37432,7 @@
           <w:pPr>
             <w:pStyle w:val="43"/>
             <w:numPr>
+              <w:ilvl w:val="2"/>
               <w:numId w:val="0"/>
             </w:numPr>
             <w:shd w:val="clear" w:fill="F5F5F5"/>
@@ -36785,6 +37469,7 @@
           <w:pPr>
             <w:pStyle w:val="43"/>
             <w:numPr>
+              <w:ilvl w:val="2"/>
               <w:numId w:val="0"/>
             </w:numPr>
             <w:shd w:val="clear" w:fill="F5F5F5"/>
@@ -36912,6 +37597,7 @@
           <w:pPr>
             <w:pStyle w:val="43"/>
             <w:numPr>
+              <w:ilvl w:val="2"/>
               <w:numId w:val="0"/>
             </w:numPr>
             <w:shd w:val="clear" w:fill="F5F5F5"/>
@@ -37000,6 +37686,7 @@
           <w:pPr>
             <w:pStyle w:val="43"/>
             <w:numPr>
+              <w:ilvl w:val="2"/>
               <w:numId w:val="0"/>
             </w:numPr>
             <w:shd w:val="clear" w:fill="F5F5F5"/>
@@ -37088,6 +37775,7 @@
           <w:pPr>
             <w:pStyle w:val="43"/>
             <w:numPr>
+              <w:ilvl w:val="2"/>
               <w:numId w:val="0"/>
             </w:numPr>
             <w:shd w:val="clear" w:fill="F5F5F5"/>
@@ -37163,6 +37851,7 @@
           <w:pPr>
             <w:pStyle w:val="43"/>
             <w:numPr>
+              <w:ilvl w:val="2"/>
               <w:numId w:val="0"/>
             </w:numPr>
             <w:shd w:val="clear" w:fill="F5F5F5"/>
@@ -37251,6 +37940,7 @@
           <w:pPr>
             <w:pStyle w:val="43"/>
             <w:numPr>
+              <w:ilvl w:val="2"/>
               <w:numId w:val="0"/>
             </w:numPr>
             <w:shd w:val="clear" w:fill="F5F5F5"/>
@@ -37274,6 +37964,7 @@
           <w:pPr>
             <w:pStyle w:val="43"/>
             <w:numPr>
+              <w:ilvl w:val="2"/>
               <w:numId w:val="0"/>
             </w:numPr>
             <w:shd w:val="clear" w:fill="F5F5F5"/>
@@ -37310,6 +38001,7 @@
           <w:pPr>
             <w:pStyle w:val="43"/>
             <w:numPr>
+              <w:ilvl w:val="2"/>
               <w:numId w:val="0"/>
             </w:numPr>
             <w:shd w:val="clear" w:fill="F5F5F5"/>
@@ -37346,6 +38038,7 @@
           <w:pPr>
             <w:pStyle w:val="43"/>
             <w:numPr>
+              <w:ilvl w:val="2"/>
               <w:numId w:val="0"/>
             </w:numPr>
             <w:shd w:val="clear" w:fill="F5F5F5"/>
@@ -37382,6 +38075,7 @@
           <w:pPr>
             <w:pStyle w:val="43"/>
             <w:numPr>
+              <w:ilvl w:val="2"/>
               <w:numId w:val="0"/>
             </w:numPr>
             <w:shd w:val="clear" w:fill="F5F5F5"/>
@@ -37483,6 +38177,7 @@
           <w:pPr>
             <w:pStyle w:val="43"/>
             <w:numPr>
+              <w:ilvl w:val="2"/>
               <w:numId w:val="0"/>
             </w:numPr>
             <w:shd w:val="clear" w:fill="F5F5F5"/>
@@ -37519,6 +38214,7 @@
           <w:pPr>
             <w:pStyle w:val="43"/>
             <w:numPr>
+              <w:ilvl w:val="2"/>
               <w:numId w:val="0"/>
             </w:numPr>
             <w:shd w:val="clear" w:fill="F5F5F5"/>
@@ -37542,6 +38238,7 @@
           <w:pPr>
             <w:pStyle w:val="43"/>
             <w:numPr>
+              <w:ilvl w:val="2"/>
               <w:numId w:val="0"/>
             </w:numPr>
             <w:shd w:val="clear" w:fill="F5F5F5"/>
@@ -37591,6 +38288,7 @@
           <w:pPr>
             <w:pStyle w:val="43"/>
             <w:numPr>
+              <w:ilvl w:val="2"/>
               <w:numId w:val="0"/>
             </w:numPr>
             <w:shd w:val="clear" w:fill="F5F5F5"/>
@@ -37809,6 +38507,7 @@
           <w:pPr>
             <w:pStyle w:val="43"/>
             <w:numPr>
+              <w:ilvl w:val="2"/>
               <w:numId w:val="0"/>
             </w:numPr>
             <w:shd w:val="clear" w:fill="F5F5F5"/>
@@ -37832,6 +38531,7 @@
           <w:pPr>
             <w:pStyle w:val="43"/>
             <w:numPr>
+              <w:ilvl w:val="2"/>
               <w:numId w:val="0"/>
             </w:numPr>
             <w:shd w:val="clear" w:fill="F5F5F5"/>
@@ -37881,6 +38581,7 @@
           <w:pPr>
             <w:pStyle w:val="43"/>
             <w:numPr>
+              <w:ilvl w:val="2"/>
               <w:numId w:val="0"/>
             </w:numPr>
             <w:shd w:val="clear" w:fill="F5F5F5"/>
@@ -37943,6 +38644,7 @@
           <w:pPr>
             <w:pStyle w:val="43"/>
             <w:numPr>
+              <w:ilvl w:val="2"/>
               <w:numId w:val="0"/>
             </w:numPr>
             <w:shd w:val="clear" w:fill="F5F5F5"/>
@@ -37979,6 +38681,7 @@
           <w:pPr>
             <w:pStyle w:val="43"/>
             <w:numPr>
+              <w:ilvl w:val="2"/>
               <w:numId w:val="0"/>
             </w:numPr>
             <w:shd w:val="clear" w:fill="F5F5F5"/>
@@ -38002,6 +38705,7 @@
           <w:pPr>
             <w:pStyle w:val="43"/>
             <w:numPr>
+              <w:ilvl w:val="2"/>
               <w:numId w:val="0"/>
             </w:numPr>
             <w:shd w:val="clear" w:fill="F5F5F5"/>
@@ -38025,6 +38729,7 @@
           <w:pPr>
             <w:pStyle w:val="43"/>
             <w:numPr>
+              <w:ilvl w:val="2"/>
               <w:numId w:val="0"/>
             </w:numPr>
             <w:shd w:val="clear" w:fill="F5F5F5"/>
@@ -38152,6 +38857,7 @@
           <w:pPr>
             <w:pStyle w:val="43"/>
             <w:numPr>
+              <w:ilvl w:val="2"/>
               <w:numId w:val="0"/>
             </w:numPr>
             <w:shd w:val="clear" w:fill="F5F5F5"/>
@@ -38175,6 +38881,7 @@
           <w:pPr>
             <w:pStyle w:val="43"/>
             <w:numPr>
+              <w:ilvl w:val="2"/>
               <w:numId w:val="0"/>
             </w:numPr>
             <w:shd w:val="clear" w:fill="F5F5F5"/>
@@ -38302,6 +39009,7 @@
           <w:pPr>
             <w:pStyle w:val="43"/>
             <w:numPr>
+              <w:ilvl w:val="2"/>
               <w:numId w:val="0"/>
             </w:numPr>
             <w:shd w:val="clear" w:fill="F5F5F5"/>
@@ -38338,6 +39046,7 @@
           <w:pPr>
             <w:pStyle w:val="43"/>
             <w:numPr>
+              <w:ilvl w:val="2"/>
               <w:numId w:val="0"/>
             </w:numPr>
             <w:shd w:val="clear" w:fill="F5F5F5"/>
@@ -38387,6 +39096,7 @@
           <w:pPr>
             <w:pStyle w:val="43"/>
             <w:numPr>
+              <w:ilvl w:val="2"/>
               <w:numId w:val="0"/>
             </w:numPr>
             <w:shd w:val="clear" w:fill="F5F5F5"/>
@@ -38501,6 +39211,7 @@
           <w:pPr>
             <w:pStyle w:val="43"/>
             <w:numPr>
+              <w:ilvl w:val="2"/>
               <w:numId w:val="0"/>
             </w:numPr>
             <w:shd w:val="clear" w:fill="F5F5F5"/>
@@ -38589,6 +39300,7 @@
           <w:pPr>
             <w:pStyle w:val="43"/>
             <w:numPr>
+              <w:ilvl w:val="2"/>
               <w:numId w:val="0"/>
             </w:numPr>
             <w:shd w:val="clear" w:fill="F5F5F5"/>
@@ -38625,6 +39337,7 @@
           <w:pPr>
             <w:pStyle w:val="43"/>
             <w:numPr>
+              <w:ilvl w:val="2"/>
               <w:numId w:val="0"/>
             </w:numPr>
             <w:shd w:val="clear" w:fill="F5F5F5"/>
@@ -38674,6 +39387,7 @@
           <w:pPr>
             <w:pStyle w:val="43"/>
             <w:numPr>
+              <w:ilvl w:val="2"/>
               <w:numId w:val="0"/>
             </w:numPr>
             <w:shd w:val="clear" w:fill="F5F5F5"/>
@@ -38723,6 +39437,7 @@
           <w:pPr>
             <w:pStyle w:val="43"/>
             <w:numPr>
+              <w:ilvl w:val="2"/>
               <w:numId w:val="0"/>
             </w:numPr>
             <w:shd w:val="clear" w:fill="F5F5F5"/>
@@ -38785,6 +39500,7 @@
           <w:pPr>
             <w:pStyle w:val="43"/>
             <w:numPr>
+              <w:ilvl w:val="2"/>
               <w:numId w:val="0"/>
             </w:numPr>
             <w:shd w:val="clear" w:fill="F5F5F5"/>
@@ -38834,6 +39550,7 @@
           <w:pPr>
             <w:pStyle w:val="43"/>
             <w:numPr>
+              <w:ilvl w:val="2"/>
               <w:numId w:val="0"/>
             </w:numPr>
             <w:shd w:val="clear" w:fill="F5F5F5"/>
@@ -38948,6 +39665,7 @@
           <w:pPr>
             <w:pStyle w:val="43"/>
             <w:numPr>
+              <w:ilvl w:val="2"/>
               <w:numId w:val="0"/>
             </w:numPr>
             <w:shd w:val="clear" w:fill="F5F5F5"/>
@@ -39062,6 +39780,7 @@
           <w:pPr>
             <w:pStyle w:val="43"/>
             <w:numPr>
+              <w:ilvl w:val="2"/>
               <w:numId w:val="0"/>
             </w:numPr>
             <w:shd w:val="clear" w:fill="F5F5F5"/>
@@ -39176,6 +39895,7 @@
           <w:pPr>
             <w:pStyle w:val="43"/>
             <w:numPr>
+              <w:ilvl w:val="2"/>
               <w:numId w:val="0"/>
             </w:numPr>
             <w:shd w:val="clear" w:fill="F5F5F5"/>
@@ -39290,6 +40010,7 @@
           <w:pPr>
             <w:pStyle w:val="43"/>
             <w:numPr>
+              <w:ilvl w:val="2"/>
               <w:numId w:val="0"/>
             </w:numPr>
             <w:shd w:val="clear" w:fill="F5F5F5"/>
@@ -39404,6 +40125,7 @@
           <w:pPr>
             <w:pStyle w:val="43"/>
             <w:numPr>
+              <w:ilvl w:val="2"/>
               <w:numId w:val="0"/>
             </w:numPr>
             <w:shd w:val="clear" w:fill="F5F5F5"/>
@@ -39518,6 +40240,7 @@
           <w:pPr>
             <w:pStyle w:val="43"/>
             <w:numPr>
+              <w:ilvl w:val="2"/>
               <w:numId w:val="0"/>
             </w:numPr>
             <w:shd w:val="clear" w:fill="F5F5F5"/>
@@ -39541,6 +40264,7 @@
           <w:pPr>
             <w:pStyle w:val="43"/>
             <w:numPr>
+              <w:ilvl w:val="2"/>
               <w:numId w:val="0"/>
             </w:numPr>
             <w:shd w:val="clear" w:fill="F5F5F5"/>
@@ -39629,6 +40353,7 @@
           <w:pPr>
             <w:pStyle w:val="43"/>
             <w:numPr>
+              <w:ilvl w:val="2"/>
               <w:numId w:val="0"/>
             </w:numPr>
             <w:shd w:val="clear" w:fill="F5F5F5"/>
@@ -39652,6 +40377,7 @@
           <w:pPr>
             <w:pStyle w:val="43"/>
             <w:numPr>
+              <w:ilvl w:val="2"/>
               <w:numId w:val="0"/>
             </w:numPr>
             <w:shd w:val="clear" w:fill="F5F5F5"/>
@@ -39701,6 +40427,7 @@
           <w:pPr>
             <w:pStyle w:val="43"/>
             <w:numPr>
+              <w:ilvl w:val="2"/>
               <w:numId w:val="0"/>
             </w:numPr>
             <w:shd w:val="clear" w:fill="F5F5F5"/>
@@ -39763,6 +40490,7 @@
           <w:pPr>
             <w:pStyle w:val="43"/>
             <w:numPr>
+              <w:ilvl w:val="2"/>
               <w:numId w:val="0"/>
             </w:numPr>
             <w:shd w:val="clear" w:fill="F5F5F5"/>
@@ -39786,6 +40514,7 @@
           <w:pPr>
             <w:pStyle w:val="43"/>
             <w:numPr>
+              <w:ilvl w:val="2"/>
               <w:numId w:val="0"/>
             </w:numPr>
             <w:shd w:val="clear" w:fill="F5F5F5"/>
@@ -39835,6 +40564,7 @@
           <w:pPr>
             <w:pStyle w:val="43"/>
             <w:numPr>
+              <w:ilvl w:val="2"/>
               <w:numId w:val="0"/>
             </w:numPr>
             <w:shd w:val="clear" w:fill="F5F5F5"/>
@@ -39949,6 +40679,7 @@
           <w:pPr>
             <w:pStyle w:val="43"/>
             <w:numPr>
+              <w:ilvl w:val="2"/>
               <w:numId w:val="0"/>
             </w:numPr>
             <w:shd w:val="clear" w:fill="F5F5F5"/>
@@ -39985,6 +40716,7 @@
           <w:pPr>
             <w:pStyle w:val="43"/>
             <w:numPr>
+              <w:ilvl w:val="2"/>
               <w:numId w:val="0"/>
             </w:numPr>
             <w:shd w:val="clear" w:fill="F5F5F5"/>
@@ -40021,6 +40753,7 @@
           <w:pPr>
             <w:pStyle w:val="43"/>
             <w:numPr>
+              <w:ilvl w:val="2"/>
               <w:numId w:val="0"/>
             </w:numPr>
             <w:shd w:val="clear" w:fill="F5F5F5"/>
@@ -40061,8 +40794,6 @@
         </w:rPr>
         <w:t>.c和飞控一样</w:t>
       </w:r>
-      <w:bookmarkStart w:id="0" w:name="_GoBack"/>
-      <w:bookmarkEnd w:id="0"/>
     </w:p>
     <w:sectPr>
       <w:pgSz w:w="11906" w:h="16838"/>
@@ -40487,7 +41218,7 @@
     <w:lsdException w:unhideWhenUsed="0" w:uiPriority="0" w:semiHidden="0" w:name="Document Map"/>
     <w:lsdException w:unhideWhenUsed="0" w:uiPriority="0" w:semiHidden="0" w:name="Plain Text"/>
     <w:lsdException w:unhideWhenUsed="0" w:uiPriority="0" w:semiHidden="0" w:name="E-mail Signature"/>
-    <w:lsdException w:unhideWhenUsed="0" w:uiPriority="0" w:semiHidden="0" w:name="Normal (Web)"/>
+    <w:lsdException w:qFormat="1" w:unhideWhenUsed="0" w:uiPriority="0" w:semiHidden="0" w:name="Normal (Web)"/>
     <w:lsdException w:unhideWhenUsed="0" w:uiPriority="0" w:semiHidden="0" w:name="HTML Acronym"/>
     <w:lsdException w:unhideWhenUsed="0" w:uiPriority="0" w:semiHidden="0" w:name="HTML Address"/>
     <w:lsdException w:unhideWhenUsed="0" w:uiPriority="0" w:semiHidden="0" w:name="HTML Cite"/>
@@ -40851,6 +41582,7 @@
   <w:style w:type="paragraph" w:styleId="11">
     <w:name w:val="Normal (Web)"/>
     <w:basedOn w:val="1"/>
+    <w:qFormat/>
     <w:uiPriority w:val="0"/>
     <w:rPr>
       <w:sz w:val="24"/>

</xml_diff>